<commit_message>
Fill the empty space at the bottom of both memo pages
Sizes each exhibit to its section, restores the Port Canaveral pricing,
trailing-multiple and oil-rally evidence, and adds a short 'When we would
cover' section with the three signals that would close the position.

Co-Authored-By: Claude Opus 5.5 <noreply@anthropic.com>
Claude-Session: https://claude.ai/code/session_01XEymX7iPffNP52qHnJAtAJ
</commit_message>
<xml_diff>
--- a/NCLH_memo_v13.docx
+++ b/NCLH_memo_v13.docx
@@ -66,7 +66,7 @@
             <wp:positionV relativeFrom="paragraph">
               <wp:posOffset>0</wp:posOffset>
             </wp:positionV>
-            <wp:extent cx="2286000" cy="1737360"/>
+            <wp:extent cx="2240280" cy="1702613"/>
             <wp:effectExtent l="0" t="0" r="0" b="0"/>
             <wp:wrapSquare wrapText="left"/>
             <wp:docPr id="101" name="ex1"/>
@@ -89,7 +89,7 @@
                   <pic:spPr>
                     <a:xfrm>
                       <a:off x="0" y="0"/>
-                      <a:ext cx="2286000" cy="1737360"/>
+                      <a:ext cx="2240280" cy="1702613"/>
                     </a:xfrm>
                     <a:prstGeom prst="rect">
                       <a:avLst/>
@@ -108,7 +108,7 @@
         <w:t xml:space="preserve">Market Expectations: </w:t>
       </w:r>
       <w:r>
-        <w:t xml:space="preserve">Since 2024 NCLH’s EV/EBITDA has tracked net yield growth closely (r = 0.87 over ten quarters), and on the four days management changed its yield outlook the stock lost 27 points against Royal and Carnival. Working back from the $21.7B enterprise value at a 9% WACC, the price needs about $3.0B of steady-state EBITDA, which is management’s March guide and net yield back above its 2025 level (Exhibit 1). The Street is less demanding but still expects a recovery: consensus 2027 EPS of $1.46–1.67 implies about $2.7B of EBITDA, and the $18.80 average target needs $2.9B.</w:t>
+        <w:t xml:space="preserve">Since 2024 NCLH’s EV/EBITDA has tracked net yield growth closely (r = 0.87 over ten quarters), and on the four days management changed its yield outlook the stock lost 27 points against Royal and Carnival. Working back from the $21.7B enterprise value at a 9% WACC, the price needs about $3.0B of steady-state EBITDA, which is management’s March guide and net yield back above its 2025 level (Exhibit 1). The Street is less demanding but still expects a recovery: consensus 2027 EPS of $1.46–1.67 implies about $2.7B of EBITDA, and the $18.80 average target needs $2.9B. At 8.1x trailing EBITDA the stock looks cheap against 10.9x in 2016–19, but that multiple sits on EBITDA we expect to fall.</w:t>
       </w:r>
     </w:p>
     <w:p>
@@ -117,7 +117,7 @@
         <w:jc w:val="both"/>
       </w:pPr>
       <w:r>
-        <w:t xml:space="preserve">Sentiment has turned faster than estimates. Ratings are 4 Buy, 15 Hold and 0 Sell (11, 4 and 0 a year ago) and short interest is 20.7% of float, yet consensus 2027 EPS moved only two cents when NCLH guided 2027 interest $0.35 a share higher on September 30. The bull argument is that the selloff was oil and the sector. Our regression puts 54% of the decline there, but NCLH moved no more than Carnival on the biggest oil days, and the NCL-specific 46% came on six company news days and did not reverse.</w:t>
+        <w:t xml:space="preserve">Sentiment has turned faster than estimates. Ratings are 4 Buy, 15 Hold and 0 Sell (11, 4 and 0 a year ago) and short interest is 20.7% of float, yet consensus 2027 EPS moved only two cents when NCLH guided 2027 interest $0.35 a share higher on September 30. The bull argument is that the selloff was oil and the sector. Our regression puts 54% of the decline there, but NCLH moved no more than Carnival on the biggest oil days, and the NCL-specific 46% came on six company news days and did not reverse. When Brent fell 38% in May and June, NCLH rose 48% but recovered only half of its underperformance against peers, and the July guidance cut erased that.</w:t>
       </w:r>
     </w:p>
     <w:p>
@@ -139,7 +139,7 @@
             <wp:positionV relativeFrom="paragraph">
               <wp:posOffset>0</wp:posOffset>
             </wp:positionV>
-            <wp:extent cx="2286000" cy="1737360"/>
+            <wp:extent cx="2560320" cy="1945843"/>
             <wp:effectExtent l="0" t="0" r="0" b="0"/>
             <wp:wrapSquare wrapText="left"/>
             <wp:docPr id="102" name="ex2"/>
@@ -162,7 +162,7 @@
                   <pic:spPr>
                     <a:xfrm>
                       <a:off x="0" y="0"/>
-                      <a:ext cx="2286000" cy="1737360"/>
+                      <a:ext cx="2560320" cy="1945843"/>
                     </a:xfrm>
                     <a:prstGeom prst="rect">
                       <a:avLst/>
@@ -181,7 +181,7 @@
         <w:t xml:space="preserve">Thesis 1: NCL is cutting prices because it is losing share in the Caribbean, and the cuts reach 1H27 revenue. </w:t>
       </w:r>
       <w:r>
-        <w:t xml:space="preserve">The Street reads the discounting as a result of the war and of execution problems that the finished island and new ships will fix in 2027. The fare data points to competition instead. On October 2 we compared the lowest fare on 4,783 itineraries with each one’s 90-day average. NCL has cut 1H27 Caribbean sailings by a median 14.5% but Europe by only 2%, although two-thirds of its European guests fly in and face higher airfares. Royal and Carnival have held Caribbean prices and are discounting Europe instead (Exhibit 2). If the war were the cause, we would expect the opposite pattern. The cuts are also recent and the new product is not stopping them: NCL went from 1 to 9 of the industry’s 10 largest monthly price cuts between December and October, sailings that call at its island are cut as much as its other Caribbean sailings, and its newest ships are cut 22% against 1% for Royal’s newest. Oceania and Regent show no cuts, so the problem is the NCL brand.</w:t>
+        <w:t xml:space="preserve">The Street reads the discounting as a result of the war and of execution problems that the finished island and new ships will fix in 2027. The fare data points to competition instead. On October 2 we compared the lowest fare on 4,783 itineraries with each one’s 90-day average. NCL has cut 1H27 Caribbean sailings by a median 14.5% but Europe by only 2%, although two-thirds of its European guests fly in and face higher airfares. Royal and Carnival have held Caribbean prices and are discounting Europe instead (Exhibit 2). If the war were the cause, we would expect the opposite pattern. The cuts are also recent and the new product is not stopping them: NCL cut prices less often than Royal in 2025, but it went from 1 to 9 of the industry’s 10 largest monthly price cuts between December and October, sailings that call at its island are cut as much as its other Caribbean sailings, and its newest ships are cut 22% against 1% for Royal’s newest. NCL now prices below the budget brand: from Port Canaveral in 1H27 its lowest fare is $94 a night against $100 at Carnival and $118 at Royal, and 71% of its Caribbean itineraries sit at record-low fares against 45% at both rivals. Oceania and Regent show no cuts, so the problem is the NCL brand.</w:t>
       </w:r>
     </w:p>
     <w:p>
@@ -213,7 +213,7 @@
             <wp:positionV relativeFrom="paragraph">
               <wp:posOffset>0</wp:posOffset>
             </wp:positionV>
-            <wp:extent cx="2286000" cy="1737360"/>
+            <wp:extent cx="2560320" cy="1945843"/>
             <wp:effectExtent l="0" t="0" r="0" b="0"/>
             <wp:wrapSquare wrapText="left"/>
             <wp:docPr id="103" name="ex3"/>
@@ -236,7 +236,7 @@
                   <pic:spPr>
                     <a:xfrm>
                       <a:off x="0" y="0"/>
-                      <a:ext cx="2286000" cy="1737360"/>
+                      <a:ext cx="2560320" cy="1945843"/>
                     </a:xfrm>
                     <a:prstGeom prst="rect">
                       <a:avLst/>
@@ -1723,10 +1723,25 @@
         <w:rPr>
           <w:b/>
         </w:rPr>
+        <w:t xml:space="preserve">When we would cover: </w:t>
+      </w:r>
+      <w:r>
+        <w:t xml:space="preserve">We would close the position if the data turns against us, whatever the price. Three signals would do it: September 30 advance ticket sales of $3.11B or more in the November 4 10-Q, which would mean the booking shortfall is closing; a fare-panel re-run showing NCL’s 1H27 Caribbean cuts back near Royal’s and Carnival’s; or a February guide for 2027 net yield above +1%. On price, the stock would be pricing our base case near $11, where the remaining downside no longer pays for the squeeze risk, so we would take most of the position off there.</w:t>
+      </w:r>
+    </w:p>
+    <w:p>
+      <w:pPr>
+        <w:spacing w:before="80" w:after="60"/>
+        <w:jc w:val="both"/>
+      </w:pPr>
+      <w:r>
+        <w:rPr>
+          <w:b/>
+        </w:rPr>
         <w:t xml:space="preserve">Catalysts: </w:t>
       </w:r>
       <w:r>
-        <w:t xml:space="preserve">November 4 (3Q26 results): earnings should beat ($0.90 guided against $0.83 consensus), so the number to watch is September 30 advance ticket sales, which we expect at $2.94B (−7% y/y). Late February: the first 2027 guide, which we expect at or below flat net yield against +1.6% in the consensus case. May 2027 (1Q27 results): we model occupancy of 101.8% and ticket price per passenger day down 2.8%.</w:t>
+        <w:t xml:space="preserve">November 4 (3Q26 results): earnings should beat ($0.90 guided against $0.83 consensus), so the number to watch is September 30 advance ticket sales, which we expect at $2.94B (−7% y/y). Late February: the first 2027 guide, which we expect at or below flat net yield against +1.6% in the consensus case. Monthly: our fare-panel re-run on 1H27 sailings. May 2027 (1Q27 results): we model occupancy of 101.8% and ticket price per passenger day down 2.8%.</w:t>
       </w:r>
     </w:p>
     <w:p>

</xml_diff>

<commit_message>
Let the memo flow across the page break and tighten the language
Removes the forced page break before Thesis 2 (Word left a large gap at the
bottom of page 1), anchors Exhibit 3 to the deposits paragraph, clears floats
before the split section, tightens paragraph spacing, adds the competition
mechanism to Thesis 1 and more deposit evidence to Thesis 2, and drops the
remaining slogan-style phrasing.

Co-Authored-By: Claude Opus 5.5 <noreply@anthropic.com>
Claude-Session: https://claude.ai/code/session_01XEymX7iPffNP52qHnJAtAJ
</commit_message>
<xml_diff>
--- a/NCLH_memo_v13.docx
+++ b/NCLH_memo_v13.docx
@@ -4,7 +4,8 @@
   <w:body>
     <w:p>
       <w:pPr>
-        <w:spacing w:after="60"/>
+        <w:widowControl/>
+        <w:spacing w:after="40"/>
         <w:jc w:val="both"/>
       </w:pPr>
       <w:r>
@@ -14,12 +15,13 @@
         <w:t xml:space="preserve">Narrative Summary: </w:t>
       </w:r>
       <w:r>
-        <w:t xml:space="preserve">Recommendation: short NCLH at $15.05, starting at a third of a full position. Our base case is worth about $10.80 (−28%) and the probability-weighted value about $12 (−21%), against +32% if consensus is right. The market prices NCLH on net yield (ticket and onboard revenue, less commissions and onboard costs, per available berth-day), and the share price assumes net yield climbs back above its 2025 level. We think it falls again in 2027, for two reasons we can measure today. First, NCL is cutting fares to fill Caribbean ships where it is losing share to Royal Caribbean and Carnival, and those cuts land on the cabins it still has to sell for 1H27. Second, NCL’s Best Price Guarantee gives guests little reason to book early, so the booking shortfall that deposits show today is likely to last into 2H27, filled late at a discount or left empty. In our model the two theses take about $140M off 2027 EBITDA through two KPIs, ticket price per passenger day and occupancy. With onboard spending and unit costs at recent run-rates, we get 2027 EBITDA of $2.47B against a Street-implied $2.69B, and EPS of $0.95 against $1.46–1.67.</w:t>
+        <w:t xml:space="preserve">Recommendation: short NCLH at $15.05, starting at a third of a full position. Our base case is worth about $10.80 (−28%) and the probability-weighted value about $12 (−21%), against +32% if consensus is right. The market prices NCLH on net yield (ticket and onboard revenue, less commissions and onboard costs, per available berth-day), and the share price assumes net yield climbs back above its 2025 level. We think it falls again in 2027, for two reasons. First, NCL is cutting fares to fill Caribbean ships where it is losing share to Royal Caribbean and Carnival, and those cuts land on the cabins it still has to sell for 1H27. Second, NCL’s Best Price Guarantee gives guests little reason to book early, so the booking shortfall that deposits show today is likely to last into 2H27, filled late at a discount or left empty. In our model the two theses take about $140M off 2027 EBITDA through two KPIs, ticket price per passenger day and occupancy. With onboard spending and unit costs at recent run-rates, we get 2027 EBITDA of $2.47B against a Street-implied $2.69B, and EPS of $0.95 against $1.46–1.67.</w:t>
       </w:r>
     </w:p>
     <w:p>
       <w:pPr>
-        <w:spacing w:before="80" w:after="60"/>
+        <w:widowControl/>
+        <w:spacing w:before="40" w:after="40"/>
         <w:jc w:val="both"/>
       </w:pPr>
       <w:r>
@@ -29,12 +31,13 @@
         <w:t xml:space="preserve">Company Overview: </w:t>
       </w:r>
       <w:r>
-        <w:t xml:space="preserve">NCLH runs 35 ships with about 75,000 berths: Norwegian Cruise Line (NCL), the mass-market brand with about 83% of berths, plus the upper-premium Oceania and luxury Regent brands. In 2025 it earned $9.8B of revenue, $2.73B of adjusted EBITDA and $2.11 of EPS, and it carries $14.8B of net debt, two-thirds of enterprise value. The debt is why small changes in net yield move the equity: each 1% is about $75M of EBITDA and 9% of the share price. 2026 went wrong quickly. NCL added about 40% more Caribbean capacity before its Great Stirrup Cay upgrade was ready, the Iran war pushed oil above $100, and guidance fell from flat net yield and $2.38 of EPS in March to about −5% and $1.50 in July. In February John Chidsey replaced Harry Sommer as CEO, under a cooperation agreement with Elliott, a holder of more than 10%.</w:t>
+        <w:t xml:space="preserve">NCLH runs 35 ships with about 75,000 berths: Norwegian Cruise Line (NCL), the mass-market brand with about 83% of berths, plus the upper-premium Oceania and luxury Regent brands. In 2025 it earned $9.8B of revenue, $2.73B of adjusted EBITDA and $2.11 of EPS, and it carries $14.8B of net debt, two-thirds of enterprise value. The debt is why small changes in net yield move the equity: each 1% is about $75M of EBITDA and 9% of the share price. Then 2026 went badly. NCL added about 40% more Caribbean capacity before its Great Stirrup Cay upgrade was ready, the Iran war pushed oil above $100, and guidance fell from flat net yield and $2.38 of EPS in March to about −5% and $1.50 in July. In February John Chidsey replaced Harry Sommer as CEO, under a cooperation agreement with Elliott, a holder of more than 10%.</w:t>
       </w:r>
     </w:p>
     <w:p>
       <w:pPr>
-        <w:spacing w:before="80" w:after="60"/>
+        <w:widowControl/>
+        <w:spacing w:before="40" w:after="40"/>
         <w:jc w:val="both"/>
       </w:pPr>
       <w:r>
@@ -44,13 +47,14 @@
         <w:t xml:space="preserve">Industry Overview: </w:t>
       </w:r>
       <w:r>
-        <w:t xml:space="preserve">Carnival (about 32% of capacity), Royal Caribbean (26%), MSC and NCLH (about 10% each) carry about 80% of the market. Demand is healthy overall: Carnival’s deposits are up 6.5% on flat capacity and Royal’s are up 5.6%. The competition is in the Caribbean, where each large line now sells a private island, and NCL arrived with the most new capacity and the last island to be finished (September 2026). Returns show who is winning: 2025 return on capital was about 16% at Royal and 12% at Carnival, against about 10% at NCLH, close to its cost of capital.</w:t>
+        <w:t xml:space="preserve">Carnival (about 32% of capacity), Royal Caribbean (26%), MSC and NCLH (about 10% each) carry about 80% of the market. Demand is healthy overall: Carnival’s deposits are up 6.5% on flat capacity and Royal’s are up 5.6%. The competition is in the Caribbean, where each large line now sells a private island, and NCL arrived with the most new capacity and the last island to be finished (September 2026). Returns differ: 2025 return on capital was about 16% at Royal and 12% at Carnival, against about 10% at NCLH, close to its cost of capital.</w:t>
       </w:r>
     </w:p>
     <w:p>
       <w:pPr>
         <w:keepLines/>
-        <w:spacing w:before="80" w:after="60"/>
+        <w:widowControl/>
+        <w:spacing w:before="40" w:after="40"/>
         <w:jc w:val="both"/>
       </w:pPr>
       <w:r>
@@ -113,7 +117,8 @@
     </w:p>
     <w:p>
       <w:pPr>
-        <w:spacing w:after="60"/>
+        <w:widowControl/>
+        <w:spacing w:after="40"/>
         <w:jc w:val="both"/>
       </w:pPr>
       <w:r>
@@ -123,7 +128,8 @@
     <w:p>
       <w:pPr>
         <w:keepLines/>
-        <w:spacing w:before="80" w:after="60"/>
+        <w:widowControl/>
+        <w:spacing w:before="40" w:after="40"/>
         <w:jc w:val="both"/>
       </w:pPr>
       <w:r>
@@ -181,23 +187,40 @@
         <w:t xml:space="preserve">Thesis 1: NCL is cutting prices because it is losing share in the Caribbean, and the cuts reach 1H27 revenue. </w:t>
       </w:r>
       <w:r>
-        <w:t xml:space="preserve">The Street reads the discounting as a result of the war and of execution problems that the finished island and new ships will fix in 2027. The fare data points to competition instead. On October 2 we compared the lowest fare on 4,783 itineraries with each one’s 90-day average. NCL has cut 1H27 Caribbean sailings by a median 14.5% but Europe by only 2%, although two-thirds of its European guests fly in and face higher airfares. Royal and Carnival have held Caribbean prices and are discounting Europe instead (Exhibit 2). If the war were the cause, we would expect the opposite pattern. The cuts are also recent and the new product is not stopping them: NCL cut prices less often than Royal in 2025, but it went from 1 to 9 of the industry’s 10 largest monthly price cuts between December and October, sailings that call at its island are cut as much as its other Caribbean sailings, and its newest ships are cut 22% against 1% for Royal’s newest. NCL now prices below the budget brand: from Port Canaveral in 1H27 its lowest fare is $94 a night against $100 at Carnival and $118 at Royal, and 71% of its Caribbean itineraries sit at record-low fares against 45% at both rivals. Oceania and Regent show no cuts, so the problem is the NCL brand.</w:t>
+        <w:t xml:space="preserve">The Street reads the discounting as a result of the war and of execution problems that the finished island and new ships will fix in 2027. We think the cause is competition. Every large line added Caribbean ships and a private island at the same time, and because a ship costs about the same to sail full or empty, the line with the weakest product fills its ships by cutting price. The fare data fits that. On October 2 we compared the lowest fare on 4,783 itineraries with each one’s 90-day average. NCL has cut 1H27 Caribbean sailings by a median 14.5% but Europe by only 2%, although two-thirds of its European guests fly in and face higher airfares. Royal and Carnival have held Caribbean prices and are discounting Europe instead (Exhibit 2). If the war were the cause, we would expect the opposite pattern. The cuts are also recent. NCL cut prices less often than Royal in 2025, but it went from 1 to 9 of the industry’s 10 largest monthly price cuts between December and October. The new product has not stopped them: sailings that call at NCL’s island are cut as much as its other Caribbean sailings, and its newest ships are cut 22% against 1% for Royal’s newest. NCL now prices below the budget brand: from Port Canaveral in 1H27 its lowest fare is $94 a night against $100 at Carnival and $118 at Royal, and 71% of its Caribbean itineraries sit at record-low fares against 45% at both rivals. Oceania and Regent show no cuts, so the problem is the NCL brand.</w:t>
       </w:r>
     </w:p>
     <w:p>
       <w:pPr>
-        <w:spacing w:after="60"/>
+        <w:widowControl/>
+        <w:spacing w:after="40"/>
         <w:jc w:val="both"/>
       </w:pPr>
       <w:r>
-        <w:t xml:space="preserve">For the model, the cuts matter only for cabins NCL has not yet sold. With a normal booking curve and the booking shortfall from Thesis 2, about 45% of 1Q27 and 55% of 2Q27 cabins are still unsold, and 74% of NCL-brand capacity sails in the Caribbean in 1Q27. Weighting the NCL brand at 65% of ticket revenue, 1H27 ticket revenue per passenger day (KPI 1) falls 2.6% y/y in our model against 1.1% in the consensus case. The risk to this view is that the cuts reverse before guests book. We re-run the fare panel monthly; cuts back near peers’ levels would undo it.</w:t>
+        <w:t xml:space="preserve">For the model, the cuts matter only for cabins NCL has not yet sold. With a normal booking curve and the booking shortfall from Thesis 2, about 45% of 1Q27 and 55% of 2Q27 cabins are still unsold, and 74% of NCL-brand capacity sails in the Caribbean in 1Q27. Weighting the NCL brand at 65% of ticket revenue, 1H27 ticket revenue per passenger day (KPI 1) falls 2.6% y/y in our model against 1.1% in the consensus case. The main risk to this view is that the cuts reverse before guests book. We re-run the fare panel monthly; cuts back near peers’ levels would undo it.</w:t>
+      </w:r>
+    </w:p>
+    <w:p>
+      <w:pPr>
+        <w:widowControl/>
+        <w:spacing w:before="40" w:after="40"/>
+        <w:jc w:val="both"/>
+      </w:pPr>
+      <w:r>
+        <w:rPr>
+          <w:b/>
+        </w:rPr>
+        <w:t xml:space="preserve">Thesis 2: The price guarantee keeps guests from booking early, so 2H27 does not recover the way consensus expects. </w:t>
+      </w:r>
+      <w:r>
+        <w:t xml:space="preserve">The consensus case has net yield up about 3% in 2H27, helped by easy comparisons and by base-loading: opening sailings at lower fares and raising them as ships fill. That only works if guests expect prices to rise. NCL’s Best Price Guarantee lets a booked guest move to any lower fare before final payment and gives a paid-up guest an upgrade or future-cruise credit afterwards; Royal offers nothing after final payment. With NCL cutting 77% of its 4Q26 Caribbean sailings of seven nights or more by 20% or more, guests have little reason to book early. Chidsey has said NCL was “holding price too high, too far out,” but filling ships with price has not worked either: in 1Q26 occupancy rose 2.3 points and net yield still fell 1.0%.</w:t>
       </w:r>
     </w:p>
     <w:p>
       <w:pPr>
         <w:keepLines/>
-        <w:pageBreakBefore/>
-        <w:spacing w:after="60"/>
+        <w:widowControl/>
+        <w:spacing w:after="40"/>
         <w:jc w:val="both"/>
       </w:pPr>
       <w:r>
@@ -213,7 +236,7 @@
             <wp:positionV relativeFrom="paragraph">
               <wp:posOffset>0</wp:posOffset>
             </wp:positionV>
-            <wp:extent cx="2560320" cy="1945843"/>
+            <wp:extent cx="2377440" cy="1806854"/>
             <wp:effectExtent l="0" t="0" r="0" b="0"/>
             <wp:wrapSquare wrapText="left"/>
             <wp:docPr id="103" name="ex3"/>
@@ -236,7 +259,7 @@
                   <pic:spPr>
                     <a:xfrm>
                       <a:off x="0" y="0"/>
-                      <a:ext cx="2560320" cy="1945843"/>
+                      <a:ext cx="2377440" cy="1806854"/>
                     </a:xfrm>
                     <a:prstGeom prst="rect">
                       <a:avLst/>
@@ -249,29 +272,19 @@
         </w:drawing>
       </w:r>
       <w:r>
-        <w:rPr>
-          <w:b/>
-        </w:rPr>
-        <w:t xml:space="preserve">Thesis 2: The price guarantee keeps guests from booking early, so 2H27 does not recover the way consensus expects. </w:t>
-      </w:r>
-      <w:r>
-        <w:t xml:space="preserve">The consensus case has net yield up about 3% in 2H27, helped by easy comparisons and by base-loading: opening sailings at lower fares and raising them as ships fill. That only works if guests expect prices to rise. NCL’s Best Price Guarantee lets a booked guest move to any lower fare before final payment and gives a paid-up guest an upgrade or future-cruise credit afterwards; Royal offers nothing after final payment. With NCL cutting 77% of its 4Q26 Caribbean sailings of seven nights or more by 20% or more, guests have learned that waiting costs them nothing.</w:t>
+        <w:t xml:space="preserve">Deposits are where this shows up first. Deposits per future berth-day are down 8.3% y/y, the seventh decline in a row, while Royal’s and Carnival’s are growing (Exhibit 3). NCL’s first-half deposit build fell 32% to $482M on about 4% more capacity, and management says it is “below its optimal booked position for the next 12 months.” Over 20 non-COVID quarters this indicator called the direction of net yield 80% of the time, though this cycle it turned negative about a year before net yield did. If booked fares fell as much as realized fares (−5.6%), the shortfall in cabins booked is about 3 points; if booked fares were flat, about 8. We use 5. We assume 80% of those cabins sell late at NCL’s current close-in discount (about 25%) and 20% sail empty, about half of what the 2026 link between deposits and occupancy implies. That puts 2027 occupancy (KPI 2) at 102.1%, down again from 2026 and a point below the consensus case, and 2H27 ticket price at −0.6% against +0.3%. The test is the November 4 10-Q: September 30 advance ticket sales below $2.97B support this, and at $3.11B or more we would cover.</w:t>
       </w:r>
     </w:p>
     <w:p>
       <w:pPr>
-        <w:spacing w:after="60"/>
-        <w:jc w:val="both"/>
+        <w:spacing w:after="0" w:line="120" w:lineRule="exact"/>
       </w:pPr>
       <w:r>
-        <w:t xml:space="preserve">Deposits are where this shows up first. Deposits per future berth-day are down 8.3% y/y, the seventh decline in a row, while Royal’s and Carnival’s are growing (Exhibit 3). If booked fares fell as much as realized fares (−5.6%), the shortfall in cabins booked is about 3 points; if booked fares were flat, about 8. We use 5. We assume 80% of those cabins sell late at NCL’s current close-in discount (about 25%) and 20% sail empty, about half of what the 2026 link between deposits and occupancy implies. That puts 2027 occupancy (KPI 2) at 102.1%, down again from 2026 and a point below the consensus case, and 2H27 ticket price at −0.6% against +0.3%. The test is the November 4 10-Q: September 30 advance ticket sales below $2.97B support this, and at $3.11B or more we would cover.</w:t>
+        <w:rPr>
+          <w:sz w:val="4"/>
+        </w:rPr>
+        <w:br w:type="textWrapping" w:clear="all"/>
       </w:r>
-    </w:p>
-    <w:p>
-      <w:pPr>
-        <w:spacing w:after="0"/>
-        <w:jc w:val="both"/>
-      </w:pPr>
     </w:p>
     <w:tbl>
       <w:tblPr>
@@ -304,6 +317,7 @@
           </w:tcPr>
           <w:p>
             <w:pPr>
+              <w:widowControl/>
               <w:spacing w:after="60"/>
               <w:jc w:val="both"/>
             </w:pPr>
@@ -957,7 +971,10 @@
           </w:tbl>
           <w:p>
             <w:pPr>
-              <w:spacing w:after="0"/>
+              <w:spacing w:after="0" w:line="120" w:lineRule="exact"/>
+              <w:rPr>
+                <w:sz w:val="4"/>
+              </w:rPr>
             </w:pPr>
           </w:p>
         </w:tc>
@@ -968,6 +985,7 @@
           </w:tcPr>
           <w:p>
             <w:pPr>
+              <w:widowControl/>
               <w:spacing w:after="0"/>
               <w:jc w:val="right"/>
             </w:pPr>
@@ -1017,7 +1035,8 @@
     </w:tbl>
     <w:p>
       <w:pPr>
-        <w:spacing w:before="80" w:after="60"/>
+        <w:widowControl/>
+        <w:spacing w:before="40" w:after="40"/>
         <w:jc w:val="both"/>
       </w:pPr>
       <w:r>
@@ -1711,12 +1730,16 @@
     </w:tbl>
     <w:p>
       <w:pPr>
-        <w:spacing w:after="0"/>
+        <w:spacing w:after="0" w:line="160" w:lineRule="exact"/>
+        <w:rPr>
+          <w:sz w:val="4"/>
+        </w:rPr>
       </w:pPr>
     </w:p>
     <w:p>
       <w:pPr>
-        <w:spacing w:before="80" w:after="60"/>
+        <w:widowControl/>
+        <w:spacing w:before="40" w:after="40"/>
         <w:jc w:val="both"/>
       </w:pPr>
       <w:r>
@@ -1731,7 +1754,8 @@
     </w:p>
     <w:p>
       <w:pPr>
-        <w:spacing w:before="80" w:after="60"/>
+        <w:widowControl/>
+        <w:spacing w:before="40" w:after="40"/>
         <w:jc w:val="both"/>
       </w:pPr>
       <w:r>
@@ -1741,12 +1765,13 @@
         <w:t xml:space="preserve">Catalysts: </w:t>
       </w:r>
       <w:r>
-        <w:t xml:space="preserve">November 4 (3Q26 results): earnings should beat ($0.90 guided against $0.83 consensus), so the number to watch is September 30 advance ticket sales, which we expect at $2.94B (−7% y/y). Late February: the first 2027 guide, which we expect at or below flat net yield against +1.6% in the consensus case. Monthly: our fare-panel re-run on 1H27 sailings. May 2027 (1Q27 results): we model occupancy of 101.8% and ticket price per passenger day down 2.8%.</w:t>
+        <w:t xml:space="preserve">November 4 (3Q26 results): earnings should beat ($0.90 guided against $0.83 consensus), so the number to watch is September 30 advance ticket sales, which we expect at $2.94B (−7% y/y). A beat on 3Q26 does not test the thesis, because those cruises were sold before the cuts. Late February: the first 2027 guide, which we expect at or below flat net yield against +1.6% in the consensus case. Monthly: our fare-panel re-run on 1H27 sailings. May 2027 (1Q27 results): we model occupancy of 101.8% and ticket price per passenger day down 2.8%.</w:t>
       </w:r>
     </w:p>
     <w:p>
       <w:pPr>
-        <w:spacing w:before="80" w:after="60"/>
+        <w:widowControl/>
+        <w:spacing w:before="40" w:after="40"/>
         <w:jc w:val="both"/>
       </w:pPr>
       <w:r>
@@ -1756,7 +1781,7 @@
         <w:t xml:space="preserve">Risks and sizing: </w:t>
       </w:r>
       <w:r>
-        <w:t xml:space="preserve">The main risk is a squeeze. 95M shares are short (5.7 days to cover), and the stock rose 48% in six weeks this spring when oil fell. About half of NCLH’s moves follow oil and its peers, so we would start with a third of the position, add on oil- or ceasefire-driven rallies and around November 4 and February, hold part of it in puts, and stop out above $19, where shorts added at about $18 are under water and the bull case begins. Other risks: Elliott’s standstill ends in February, cost savings beyond the $225M identified would offset our cost assumption, and the fare panel is a snapshot, so the cuts could reverse.</w:t>
+        <w:t xml:space="preserve">The main risk is a squeeze. 95M shares are short (5.7 days to cover), and the stock rose 48% in six weeks this spring when oil fell. About half of NCLH’s moves follow oil and its peers, so we would start with a third of the position, add on oil- or ceasefire-driven rallies and around November 4 and February, hold part of it in puts, and stop out above $19, where shorts added at about $18 are under water and the bull case begins. Other risks: Elliott’s standstill ends in February, cost savings beyond the $225M identified would offset our cost assumption, and the fare panel is a snapshot, so the cuts could reverse. We could also be early: in this cycle deposits turned down about a year before net yield did, so the 2027 shortfall may show up later than our quarterly path assumes.</w:t>
       </w:r>
     </w:p>
     <w:p>

</xml_diff>

<commit_message>
Make Thesis 2 about the predictable deposit lag; frame the memo as two data sets -> two KPIs
Model: KPI 2 Booking Build section F measures the deposit-to-net-yield lead
before and after COVID (one to two quarters before, about four since, as
booking windows lengthened), with a four-quarter fit as a cross-check on 1H27.
Memo: Thesis 2 rewritten around that lag, Exhibit 3 shows deposits shifted
four quarters, and the summary and page-2 table map fare panel -> KPI 1 and
deposits -> KPI 2 -> EBITDA.

Co-Authored-By: Claude Opus 5.5 <noreply@anthropic.com>
Claude-Session: https://claude.ai/code/session_01XEymX7iPffNP52qHnJAtAJ
</commit_message>
<xml_diff>
--- a/NCLH_memo_v13.docx
+++ b/NCLH_memo_v13.docx
@@ -15,7 +15,7 @@
         <w:t xml:space="preserve">Narrative Summary: </w:t>
       </w:r>
       <w:r>
-        <w:t xml:space="preserve">Recommendation: short NCLH at $15.05, starting at a third of a full position. Our base case is worth about $10.80 (−28%) and the probability-weighted value about $12 (−21%), against +32% if consensus is right. The market prices NCLH on net yield (ticket and onboard revenue, less commissions and onboard costs, per available berth-day), and the share price assumes net yield climbs back above its 2025 level. We think it falls again in 2027, for two reasons. First, NCL is cutting fares to fill Caribbean ships where it is losing share to Royal Caribbean and Carnival, and those cuts land on the cabins it still has to sell for 1H27. Second, NCL’s Best Price Guarantee gives guests little reason to book early, so the booking shortfall that deposits show today is likely to last into 2H27, filled late at a discount or left empty. In our model the two theses take about $140M off 2027 EBITDA through two KPIs, ticket price per passenger day and occupancy. With onboard spending and unit costs at recent run-rates, we get 2027 EBITDA of $2.47B against a Street-implied $2.69B, and EPS of $0.95 against $1.46–1.67.</w:t>
+        <w:t xml:space="preserve">Recommendation: short NCLH at $15.05, starting at a third of a full position. Our base case is worth about $10.80 (−28%) and the probability-weighted value about $12 (−21%), against +32% if consensus is right. The market prices NCLH on net yield (ticket and onboard revenue, less commissions and onboard costs, per available berth-day), and the share price assumes net yield climbs back above its 2025 level. We think it falls again in 2027, and two sets of alternative data show why. A fare panel of 4,783 itineraries shows NCL cutting Caribbean fares where it is losing share to Royal Caribbean and Carnival; on the cabins NCL still has to sell, that lowers 1H27 ticket price per passenger day (KPI 1). NCL’s deposits show a booking shortfall that its Best Price Guarantee gives guests no reason to close, and since COVID deposits have reached net yield about four quarters later; that lowers 2027 occupancy (KPI 2) and keeps 2H27 prices from recovering. In our model the two KPIs take about $140M off 2027 EBITDA. With onboard spending and unit costs at recent run-rates, we get 2027 EBITDA of $2.47B against a Street-implied $2.69B, and EPS of $0.95 against $1.46–1.67.</w:t>
       </w:r>
     </w:p>
     <w:p>
@@ -210,10 +210,10 @@
         <w:rPr>
           <w:b/>
         </w:rPr>
-        <w:t xml:space="preserve">Thesis 2: The price guarantee keeps guests from booking early, so 2H27 does not recover the way consensus expects. </w:t>
+        <w:t xml:space="preserve">Thesis 2: NCL’s booking shortfall is already in its deposits, and deposits reach net yield about a year later. </w:t>
       </w:r>
       <w:r>
-        <w:t xml:space="preserve">The consensus case has net yield up about 3% in 2H27, helped by easy comparisons and by base-loading: opening sailings at lower fares and raising them as ships fill. That only works if guests expect prices to rise. NCL’s Best Price Guarantee lets a booked guest move to any lower fare before final payment and gives a paid-up guest an upgrade or future-cruise credit afterwards; Royal offers nothing after final payment. With NCL cutting 77% of its 4Q26 Caribbean sailings of seven nights or more by 20% or more, guests have little reason to book early. Chidsey has said NCL was “holding price too high, too far out,” but filling ships with price has not worked either: in 1Q26 occupancy rose 2.3 points and net yield still fell 1.0%.</w:t>
+        <w:t xml:space="preserve">The consensus case has net yield up about 3% in 2H27, helped by easy comparisons and by base-loading: opening sailings at lower fares and raising them as ships fill. That needs guests who book early because they expect prices to rise. NCL’s Best Price Guarantee removes the reason to: before final payment a booked guest can move to any lower fare, and after it a guest on a cruise of six nights or more gets an upgrade or future-cruise credit for the difference, while Royal offers nothing after final payment. NCL has also shown guests that it cuts late: 77% of its 4Q26 Caribbean sailings of seven nights or more have been cut 20% or more. Chidsey has said NCL was “holding price too high, too far out,” but filling ships with price has not worked either: in 1Q26 occupancy rose 2.3 points and net yield still fell 1.0%.</w:t>
       </w:r>
     </w:p>
     <w:p>
@@ -236,7 +236,7 @@
             <wp:positionV relativeFrom="paragraph">
               <wp:posOffset>0</wp:posOffset>
             </wp:positionV>
-            <wp:extent cx="2377440" cy="1806854"/>
+            <wp:extent cx="2377440" cy="1854403"/>
             <wp:effectExtent l="0" t="0" r="0" b="0"/>
             <wp:wrapSquare wrapText="left"/>
             <wp:docPr id="103" name="ex3"/>
@@ -259,7 +259,7 @@
                   <pic:spPr>
                     <a:xfrm>
                       <a:off x="0" y="0"/>
-                      <a:ext cx="2377440" cy="1806854"/>
+                      <a:ext cx="2377440" cy="1854403"/>
                     </a:xfrm>
                     <a:prstGeom prst="rect">
                       <a:avLst/>
@@ -272,7 +272,17 @@
         </w:drawing>
       </w:r>
       <w:r>
-        <w:t xml:space="preserve">Deposits are where this shows up first. Deposits per future berth-day are down 8.3% y/y, the seventh decline in a row, while Royal’s and Carnival’s are growing (Exhibit 3). NCL’s first-half deposit build fell 32% to $482M on about 4% more capacity, and management says it is “below its optimal booked position for the next 12 months.” Over 20 non-COVID quarters this indicator called the direction of net yield 80% of the time, though this cycle it turned negative about a year before net yield did. If booked fares fell as much as realized fares (−5.6%), the shortfall in cabins booked is about 3 points; if booked fares were flat, about 8. We use 5. We assume 80% of those cabins sell late at NCL’s current close-in discount (about 25%) and 20% sail empty, about half of what the 2026 link between deposits and occupancy implies. That puts 2027 occupancy (KPI 2) at 102.1%, down again from 2026 and a point below the consensus case, and 2H27 ticket price at −0.6% against +0.3%. The test is the November 4 10-Q: September 30 advance ticket sales below $2.97B support this, and at $3.11B or more we would cover.</w:t>
+        <w:t xml:space="preserve">The shortfall is already visible. Deposits per future berth-day are down 8.3% y/y, the seventh decline in a row, while Royal’s and Carnival’s are growing, and NCL says it is “below its optimal booked position for the next 12 months.” What makes this useful is that the lag from deposits to net yield is predictable. Guests pay deposits when they book, so deposits move first. Before COVID the lead was one to two quarters. Since COVID guests book further ahead (advance ticket sales are about a third of annual revenue, against a quarter in 2016–18), and the lead has stretched to about four quarters: deposits turned negative in December 2024 and net yield followed in 1Q26. At a four-quarter lead the indicator has called the direction of net yield in 5 of 6 reported quarters, and the 3Q26 guide and 4Q26 implied figure fit as well (Exhibit 3). On that lag, the March and June readings fall on 1Q27 and 2Q27, the quarters consensus expects to recover. A simple fit over those eight quarters points to 1H27 net yield of about −4%, against −2.6% in our model and −0.2% in the consensus case.</w:t>
+      </w:r>
+    </w:p>
+    <w:p>
+      <w:pPr>
+        <w:widowControl/>
+        <w:spacing w:after="40"/>
+        <w:jc w:val="both"/>
+      </w:pPr>
+      <w:r>
+        <w:t xml:space="preserve">In the model we size the shortfall from deposits: if booked fares fell as much as realized fares (−5.6%), about 3 points fewer cabins are booked; if booked fares were flat, about 8. We use 5. We assume 20% of those cabins sail empty, about half of what the 2026 link between deposits and occupancy implies, and the rest sell late at NCL’s current close-in discount of about 25%. That puts 2027 occupancy (KPI 2) at 102.1%, down again from 2026 and a point below the consensus case, and takes about 0.9 points off 2H27 ticket price. The first test is the November 4 10-Q: September 30 advance ticket sales below $2.97B support this, and at $3.11B or more we would cover.</w:t>
       </w:r>
     </w:p>
     <w:p>
@@ -328,7 +338,7 @@
               <w:t xml:space="preserve">From the data to the model: </w:t>
             </w:r>
             <w:r>
-              <w:t xml:space="preserve">Net yield is occupancy times revenue per passenger day, so the theses enter the model in two places: Thesis 1 moves 1H27 ticket price, and Thesis 2 moves 2H27 ticket price and 2027 occupancy. Together they take $137M off 2027 EBITDA (Exhibit 4). The rest of our gap to the consensus case is not part of either thesis. Onboard spending grows 2% in our model (it fell 0.3% in 2025 and rose about 1% in 1H26) against 3.5%, and unit costs rise 1% against a 0.5% decline. On the two theses alone, the shares are worth about $13.50 (−10%).</w:t>
+              <w:t xml:space="preserve">Each data set moves one KPI, and each KPI is a line in our quarterly net yield build (net yield = occupancy × revenue per passenger day). The fare panel sets the price cut on unsold cabins (KPI 1); deposits set the booking shortfall, which shows up as empty cabins (KPI 2) and as late discounts on the rest. Together they take $137M off 2027 EBITDA (Exhibit 4). The rest of our gap to the consensus case is not part of either thesis: onboard spending grows 2% in our model (it fell 0.3% in 2025 and rose about 1% in 1H26) against 3.5%, and unit costs rise 1% against a 0.5% decline. On the two theses alone, the shares are worth about $13.50 (−10%).</w:t>
             </w:r>
           </w:p>
           <w:tbl>
@@ -375,7 +385,7 @@
                       <w:b/>
                       <w:sz w:val="15"/>
                     </w:rPr>
-                    <w:t xml:space="preserve">Driver (2027)</w:t>
+                    <w:t xml:space="preserve">Alternative data → KPI (2027)</w:t>
                   </w:r>
                 </w:p>
               </w:tc>
@@ -457,7 +467,7 @@
                     <w:rPr>
                       <w:sz w:val="15"/>
                     </w:rPr>
-                    <w:t xml:space="preserve">KPI 1: 1H27 ticket price y/y (Thesis 1)</w:t>
+                    <w:t xml:space="preserve">Fare panel → KPI 1: 1H27 ticket price y/y</w:t>
                   </w:r>
                 </w:p>
               </w:tc>
@@ -533,7 +543,83 @@
                     <w:rPr>
                       <w:sz w:val="15"/>
                     </w:rPr>
-                    <w:t xml:space="preserve">KPI 1: 2H27 ticket price y/y (Thesis 2)</w:t>
+                    <w:t xml:space="preserve">Deposits → KPI 2: occupancy</w:t>
+                  </w:r>
+                </w:p>
+              </w:tc>
+              <w:tc>
+                <w:tcPr>
+                  <w:tcW w:w="1150" w:type="dxa"/>
+                  <w:vAlign w:val="center"/>
+                </w:tcPr>
+                <w:p>
+                  <w:pPr>
+                    <w:spacing w:after="0"/>
+                    <w:jc w:val="center"/>
+                  </w:pPr>
+                  <w:r>
+                    <w:rPr>
+                      <w:sz w:val="15"/>
+                    </w:rPr>
+                    <w:t xml:space="preserve">103.1%</w:t>
+                  </w:r>
+                </w:p>
+              </w:tc>
+              <w:tc>
+                <w:tcPr>
+                  <w:tcW w:w="1150" w:type="dxa"/>
+                  <w:vAlign w:val="center"/>
+                </w:tcPr>
+                <w:p>
+                  <w:pPr>
+                    <w:spacing w:after="0"/>
+                    <w:jc w:val="center"/>
+                  </w:pPr>
+                  <w:r>
+                    <w:rPr>
+                      <w:sz w:val="15"/>
+                    </w:rPr>
+                    <w:t xml:space="preserve">102.1%</w:t>
+                  </w:r>
+                </w:p>
+              </w:tc>
+              <w:tc>
+                <w:tcPr>
+                  <w:tcW w:w="1000" w:type="dxa"/>
+                  <w:vAlign w:val="center"/>
+                </w:tcPr>
+                <w:p>
+                  <w:pPr>
+                    <w:spacing w:after="0"/>
+                    <w:jc w:val="center"/>
+                  </w:pPr>
+                  <w:r>
+                    <w:rPr>
+                      <w:sz w:val="15"/>
+                    </w:rPr>
+                    <w:t xml:space="preserve">−76</w:t>
+                  </w:r>
+                </w:p>
+              </w:tc>
+            </w:tr>
+            <w:tr>
+              <w:trPr>
+                <w:cantSplit/>
+              </w:trPr>
+              <w:tc>
+                <w:tcPr>
+                  <w:tcW w:w="2700" w:type="dxa"/>
+                  <w:vAlign w:val="center"/>
+                </w:tcPr>
+                <w:p>
+                  <w:pPr>
+                    <w:spacing w:after="0"/>
+                  </w:pPr>
+                  <w:r>
+                    <w:rPr>
+                      <w:sz w:val="15"/>
+                    </w:rPr>
+                    <w:t xml:space="preserve">Deposits → KPI 1: 2H27 ticket price y/y</w:t>
                   </w:r>
                 </w:p>
               </w:tc>
@@ -588,82 +674,6 @@
                       <w:sz w:val="15"/>
                     </w:rPr>
                     <w:t xml:space="preserve">−17</w:t>
-                  </w:r>
-                </w:p>
-              </w:tc>
-            </w:tr>
-            <w:tr>
-              <w:trPr>
-                <w:cantSplit/>
-              </w:trPr>
-              <w:tc>
-                <w:tcPr>
-                  <w:tcW w:w="2700" w:type="dxa"/>
-                  <w:vAlign w:val="center"/>
-                </w:tcPr>
-                <w:p>
-                  <w:pPr>
-                    <w:spacing w:after="0"/>
-                  </w:pPr>
-                  <w:r>
-                    <w:rPr>
-                      <w:sz w:val="15"/>
-                    </w:rPr>
-                    <w:t xml:space="preserve">KPI 2: occupancy (Thesis 2)</w:t>
-                  </w:r>
-                </w:p>
-              </w:tc>
-              <w:tc>
-                <w:tcPr>
-                  <w:tcW w:w="1150" w:type="dxa"/>
-                  <w:vAlign w:val="center"/>
-                </w:tcPr>
-                <w:p>
-                  <w:pPr>
-                    <w:spacing w:after="0"/>
-                    <w:jc w:val="center"/>
-                  </w:pPr>
-                  <w:r>
-                    <w:rPr>
-                      <w:sz w:val="15"/>
-                    </w:rPr>
-                    <w:t xml:space="preserve">103.1%</w:t>
-                  </w:r>
-                </w:p>
-              </w:tc>
-              <w:tc>
-                <w:tcPr>
-                  <w:tcW w:w="1150" w:type="dxa"/>
-                  <w:vAlign w:val="center"/>
-                </w:tcPr>
-                <w:p>
-                  <w:pPr>
-                    <w:spacing w:after="0"/>
-                    <w:jc w:val="center"/>
-                  </w:pPr>
-                  <w:r>
-                    <w:rPr>
-                      <w:sz w:val="15"/>
-                    </w:rPr>
-                    <w:t xml:space="preserve">102.1%</w:t>
-                  </w:r>
-                </w:p>
-              </w:tc>
-              <w:tc>
-                <w:tcPr>
-                  <w:tcW w:w="1000" w:type="dxa"/>
-                  <w:vAlign w:val="center"/>
-                </w:tcPr>
-                <w:p>
-                  <w:pPr>
-                    <w:spacing w:after="0"/>
-                    <w:jc w:val="center"/>
-                  </w:pPr>
-                  <w:r>
-                    <w:rPr>
-                      <w:sz w:val="15"/>
-                    </w:rPr>
-                    <w:t xml:space="preserve">−76</w:t>
                   </w:r>
                 </w:p>
               </w:tc>
@@ -1749,7 +1759,7 @@
         <w:t xml:space="preserve">When we would cover: </w:t>
       </w:r>
       <w:r>
-        <w:t xml:space="preserve">We would close the position if the data turns against us, whatever the price. Three signals would do it: September 30 advance ticket sales of $3.11B or more in the November 4 10-Q, which would mean the booking shortfall is closing; a fare-panel re-run showing NCL’s 1H27 Caribbean cuts back near Royal’s and Carnival’s; or a February guide for 2027 net yield above +1%. On price, the stock would be pricing our base case near $11, where the remaining downside no longer pays for the squeeze risk, so we would take most of the position off there.</w:t>
+        <w:t xml:space="preserve">We would close the position if the data turns against us, whatever the price: September 30 advance ticket sales of $3.11B or more, a fare-panel re-run showing NCL’s 1H27 Caribbean cuts back near Royal’s and Carnival’s, or a February guide for 2027 net yield above +1%. On price, we would take most of the position off near $11, where the stock prices our base case and the remaining downside no longer pays for the squeeze risk.</w:t>
       </w:r>
     </w:p>
     <w:p>

</xml_diff>

<commit_message>
Final pass: tie the full EBITDA gap to the two data sets, calibrate the NCL brand weight, answer critiques
Consensus case at run-rate costs reproduces Street revenue and EBITDA, so the
whole gap to our case is fare-panel and deposit driven; consensus EPS also needs
falling unit costs. NCL's 65% share of ticket revenue is calibrated to reported
2025 revenue (66%). Year-end net debt now links to the model. Thesis to KPIs
lists the critiques we expect and where the model answers them. Memo updated
to match, upside line removed from the summary.

Co-Authored-By: Claude Opus 5.5 <noreply@anthropic.com>
Claude-Session: https://claude.ai/code/session_01XEymX7iPffNP52qHnJAtAJ
</commit_message>
<xml_diff>
--- a/NCLH_memo_v13.docx
+++ b/NCLH_memo_v13.docx
@@ -15,7 +15,7 @@
         <w:t xml:space="preserve">Narrative Summary: </w:t>
       </w:r>
       <w:r>
-        <w:t xml:space="preserve">Recommendation: short NCLH at $15.05, starting at a third of a full position. Our base case is worth about $10.80 (−28%) and the probability-weighted value about $12 (−21%), against +32% if consensus is right. The market prices NCLH on net yield (ticket and onboard revenue, less commissions and onboard costs, per available berth-day), and the share price assumes net yield climbs back above its 2025 level. We think it falls again in 2027, and two sets of alternative data show why. A fare panel of 4,783 itineraries shows NCL cutting Caribbean fares where it is losing share to Royal Caribbean and Carnival; on the cabins NCL still has to sell, that lowers 1H27 ticket price per passenger day (KPI 1). NCL’s deposits show a booking shortfall that its Best Price Guarantee gives guests no reason to close, and since COVID deposits have reached net yield about four quarters later; that lowers 2027 occupancy (KPI 2) and keeps 2H27 prices from recovering. In our model the two KPIs take about $140M off 2027 EBITDA. With onboard spending and unit costs at recent run-rates, we get 2027 EBITDA of $2.47B against a Street-implied $2.69B, and EPS of $0.95 against $1.46–1.67.</w:t>
+        <w:t xml:space="preserve">Recommendation: short NCLH at $15.05, starting at a third of a full position. Our base case is worth about $10.80 (−28%) and the probability-weighted value about $11.90 (−21%). The market prices NCLH on net yield (ticket and onboard revenue, less commissions and onboard costs, per available berth-day), and the share price assumes net yield climbs back above its 2025 level. We think it falls again in 2027, and two sets of alternative data show why. A fare panel of 4,783 itineraries shows NCL cutting Caribbean fares where it is losing share to Royal Caribbean and Carnival; applied to the cabins NCL still has to sell, that lowers ticket price per passenger day (KPI 1). NCL’s deposits show a booking shortfall that its Best Price Guarantee gives guests no reason to close, and since COVID deposits have reached net yield about four quarters later; that lowers 2027 occupancy (KPI 2) and keeps 2H27 prices from recovering. Our 2027 EBITDA of $2.47B is $221M below the Street’s $2.69B, and the two data sets account for almost all of that gap: lower ticket prices and occupancy, plus the lower onboard spending of guests won with discounts. Our EPS is $0.95; consensus of $1.46–1.67 is further off because it has not absorbed the September interest guide.</w:t>
       </w:r>
     </w:p>
     <w:p>
@@ -112,7 +112,7 @@
         <w:t xml:space="preserve">Market Expectations: </w:t>
       </w:r>
       <w:r>
-        <w:t xml:space="preserve">Since 2024 NCLH’s EV/EBITDA has tracked net yield growth closely (r = 0.87 over ten quarters), and on the four days management changed its yield outlook the stock lost 27 points against Royal and Carnival. Working back from the $21.7B enterprise value at a 9% WACC, the price needs about $3.0B of steady-state EBITDA, which is management’s March guide and net yield back above its 2025 level (Exhibit 1). The Street is less demanding but still expects a recovery: consensus 2027 EPS of $1.46–1.67 implies about $2.7B of EBITDA, and the $18.80 average target needs $2.9B. At 8.1x trailing EBITDA the stock looks cheap against 10.9x in 2016–19, but that multiple sits on EBITDA we expect to fall.</w:t>
+        <w:t xml:space="preserve">Since 2024 NCLH’s EV/EBITDA has tracked net yield growth closely (r = 0.87 over ten quarters), and on the four days management changed its yield outlook the stock lost 27 points against Royal and Carnival. Working back from the $21.7B enterprise value at a 9% WACC, the price needs about $3.0B of steady-state EBITDA, which is management’s March guide and net yield back above its 2025 level (Exhibit 1). The Street is less demanding but still expects a recovery: it models 2027 revenue of $10.6B and EBITDA of $2.69B, and the $18.80 average target needs $2.9B. At 8.1x trailing EBITDA the stock looks cheap against 10.9x in 2016–19, but that multiple sits on EBITDA we expect to fall.</w:t>
       </w:r>
     </w:p>
     <w:p>
@@ -122,7 +122,7 @@
         <w:jc w:val="both"/>
       </w:pPr>
       <w:r>
-        <w:t xml:space="preserve">Sentiment has turned faster than estimates. Ratings are 4 Buy, 15 Hold and 0 Sell (11, 4 and 0 a year ago) and short interest is 20.7% of float, yet consensus 2027 EPS moved only two cents when NCLH guided 2027 interest $0.35 a share higher on September 30. The bull argument is that the selloff was oil and the sector. Our regression puts 54% of the decline there, but NCLH moved no more than Carnival on the biggest oil days, and the NCL-specific 46% came on six company news days and did not reverse. When Brent fell 38% in May and June, NCLH rose 48% but recovered only half of its underperformance against peers, and the July guidance cut erased that.</w:t>
+        <w:t xml:space="preserve">Sentiment has turned faster than estimates. Ratings are 4 Buy, 15 Hold and 0 Sell (11, 4 and 0 a year ago) and short interest is 20.7% of float, yet consensus 2027 EPS moved only two cents when NCLH guided 2027 interest $0.35 a share higher on September 30; at the Street’s own EBITDA and the guided interest, EPS is about $1.41. The bull argument is that the selloff was oil and the sector. Our regression puts 54% of the decline there, but NCLH moved no more than Carnival on the biggest oil days, and the NCL-specific 46% came on six company news days and did not reverse.</w:t>
       </w:r>
     </w:p>
     <w:p>
@@ -187,7 +187,7 @@
         <w:t xml:space="preserve">Thesis 1: NCL is cutting prices because it is losing share in the Caribbean, and the cuts reach 1H27 revenue. </w:t>
       </w:r>
       <w:r>
-        <w:t xml:space="preserve">The Street reads the discounting as a result of the war and of execution problems that the finished island and new ships will fix in 2027. We think the cause is competition. Every large line added Caribbean ships and a private island at the same time, and because a ship costs about the same to sail full or empty, the line with the weakest product fills its ships by cutting price. The fare data fits that. On October 2 we compared the lowest fare on 4,783 itineraries with each one’s 90-day average. NCL has cut 1H27 Caribbean sailings by a median 14.5% but Europe by only 2%, although two-thirds of its European guests fly in and face higher airfares. Royal and Carnival have held Caribbean prices and are discounting Europe instead (Exhibit 2). If the war were the cause, we would expect the opposite pattern. The cuts are also recent. NCL cut prices less often than Royal in 2025, but it went from 1 to 9 of the industry’s 10 largest monthly price cuts between December and October. The new product has not stopped them: sailings that call at NCL’s island are cut as much as its other Caribbean sailings, and its newest ships are cut 22% against 1% for Royal’s newest. NCL now prices below the budget brand: from Port Canaveral in 1H27 its lowest fare is $94 a night against $100 at Carnival and $118 at Royal, and 71% of its Caribbean itineraries sit at record-low fares against 45% at both rivals. Oceania and Regent show no cuts, so the problem is the NCL brand.</w:t>
+        <w:t xml:space="preserve">The Street reads the discounting as a result of the war and of execution problems that the finished island and new ships will fix in 2027. We think the cause is competition. Every large line added Caribbean ships and a private island at the same time, and because a ship costs about the same to sail full or empty, the line with the weakest product fills its ships by cutting price. The fare data fits that. On October 2 we compared the lowest fare on 4,783 itineraries with each one’s 90-day average. NCL has cut 1H27 Caribbean sailings by a median 14.5% but Europe by only 2%, although two-thirds of its European guests fly in and face higher airfares. Royal and Carnival, which also added Caribbean ships, have held Caribbean prices and are discounting Europe instead (Exhibit 2). If the war were the cause, we would expect the opposite pattern. The cuts are also recent. NCL cut prices less often than Royal in 2025, but it went from 1 to 9 of the industry’s 10 largest monthly price cuts between December and October. The new product has not stopped them: sailings that call at NCL’s island are cut as much as its other Caribbean sailings, and its newest ships are cut 22% against 1% for Royal’s newest. NCL now prices below the budget brand: from Port Canaveral in 1H27 its lowest fare is $94 a night against $100 at Carnival and $118 at Royal, and 71% of its Caribbean itineraries sit at record-low fares against 45% at both rivals. Oceania and Regent show no cuts, so the problem is the NCL brand.</w:t>
       </w:r>
     </w:p>
     <w:p>
@@ -197,7 +197,7 @@
         <w:jc w:val="both"/>
       </w:pPr>
       <w:r>
-        <w:t xml:space="preserve">For the model, the cuts matter only for cabins NCL has not yet sold. With a normal booking curve and the booking shortfall from Thesis 2, about 45% of 1Q27 and 55% of 2Q27 cabins are still unsold, and 74% of NCL-brand capacity sails in the Caribbean in 1Q27. Weighting the NCL brand at 65% of ticket revenue, 1H27 ticket revenue per passenger day (KPI 1) falls 2.6% y/y in our model against 1.1% in the consensus case. The main risk to this view is that the cuts reverse before guests book. We re-run the fare panel monthly; cuts back near peers’ levels would undo it.</w:t>
+        <w:t xml:space="preserve">Lowest fares are not realized prices, but realized prices are moving the same way: NCLH’s ticket revenue per passenger day fell 5.6% in 1H26. For the model, the cuts matter only for cabins NCL has not yet sold. With a normal booking curve and the booking shortfall from Thesis 2, about 45% of 1Q27 and 55% of 2Q27 cabins are still unsold, and 74% of NCL-brand capacity sails in the Caribbean in 1Q27. We weight the NCL brand at 65% of ticket revenue: if Oceania and Regent sell near their lowest fares, as all-suite ships tend to, NCL must make up about 66% of the $265 of ticket revenue per passenger day NCLH reported for 2025. That takes 1H27 ticket price (KPI 1) to −2.6% y/y against −1.1% in the consensus case. The same data, with Q4 sailings cut 36%, puts 4Q26 net yield at −7.0%, half a point below the implied guide. The main risk is that the cuts reverse before guests book; we re-run the fare panel monthly.</w:t>
       </w:r>
     </w:p>
     <w:p>
@@ -213,7 +213,7 @@
         <w:t xml:space="preserve">Thesis 2: NCL’s booking shortfall is already in its deposits, and deposits reach net yield about a year later. </w:t>
       </w:r>
       <w:r>
-        <w:t xml:space="preserve">The consensus case has net yield up about 3% in 2H27, helped by easy comparisons and by base-loading: opening sailings at lower fares and raising them as ships fill. That needs guests who book early because they expect prices to rise. NCL’s Best Price Guarantee removes the reason to: before final payment a booked guest can move to any lower fare, and after it a guest on a cruise of six nights or more gets an upgrade or future-cruise credit for the difference, while Royal offers nothing after final payment. NCL has also shown guests that it cuts late: 77% of its 4Q26 Caribbean sailings of seven nights or more have been cut 20% or more. Chidsey has said NCL was “holding price too high, too far out,” but filling ships with price has not worked either: in 1Q26 occupancy rose 2.3 points and net yield still fell 1.0%.</w:t>
+        <w:t xml:space="preserve">The consensus case has net yield up about 3% in 2H27, helped by easy comparisons and by base-loading: opening sailings at lower fares and raising them as ships fill. That needs guests who book early because they expect prices to rise. NCL’s Best Price Guarantee removes the reason to: before final payment a booked guest can move to any lower fare, and after it a guest on a cruise of six nights or more gets an upgrade or future-cruise credit for the difference, while Royal offers nothing after final payment. NCL has also shown guests that it cuts late: 77% of its 4Q26 Caribbean sailings of seven nights or more have been cut 20% or more. Filling ships late with price has costs beyond the fare: in 1Q26 occupancy rose 2.3 points, but net yield still fell 1.0% and onboard revenue per passenger day fell 2.9%, because guests who buy on discount spend less on board.</w:t>
       </w:r>
     </w:p>
     <w:p>
@@ -272,7 +272,7 @@
         </w:drawing>
       </w:r>
       <w:r>
-        <w:t xml:space="preserve">The shortfall is already visible. Deposits per future berth-day are down 8.3% y/y, the seventh decline in a row, while Royal’s and Carnival’s are growing, and NCL says it is “below its optimal booked position for the next 12 months.” What makes this useful is that the lag from deposits to net yield is predictable. Guests pay deposits when they book, so deposits move first. Before COVID the lead was one to two quarters. Since COVID guests book further ahead (advance ticket sales are about a third of annual revenue, against a quarter in 2016–18), and the lead has stretched to about four quarters: deposits turned negative in December 2024 and net yield followed in 1Q26. At a four-quarter lead the indicator has called the direction of net yield in 5 of 6 reported quarters, and the 3Q26 guide and 4Q26 implied figure fit as well (Exhibit 3). On that lag, the March and June readings fall on 1Q27 and 2Q27, the quarters consensus expects to recover. A simple fit over those eight quarters points to 1H27 net yield of about −4%, against −2.6% in our model and −0.2% in the consensus case.</w:t>
+        <w:t xml:space="preserve">The shortfall is already visible. Deposits per future berth-day are down 8.3% y/y, the seventh decline in a row, while Royal’s and Carnival’s are growing, and NCL says it is “below its optimal booked position for the next 12 months.” This is not a shift to shorter cruises, which book later: about a third of 4Q26 Caribbean itineraries are 3–5 nights at NCL, Royal and Carnival alike, and NCL is cutting both lengths. The lag from deposits to net yield is also predictable. Guests pay deposits when they book, so deposits move first. Before COVID the lead was one to two quarters. Since COVID guests book further ahead (advance ticket sales are about a third of annual revenue, against a quarter in 2016–18), and the lead has stretched to about four quarters: deposits turned negative in December 2024 and net yield followed in 1Q26. At a four-quarter lead the indicator has called the direction of net yield in 5 of 6 reported quarters, and the 3Q26 guide and 4Q26 implied figure fit as well (Exhibit 3). On that lag, the March and June readings fall on 1Q27 and 2Q27, the quarters consensus expects to recover. A simple fit over those eight quarters points to 1H27 net yield of about −4%, against −2.6% in our model and −0.2% in the consensus case.</w:t>
       </w:r>
     </w:p>
     <w:p>
@@ -282,7 +282,7 @@
         <w:jc w:val="both"/>
       </w:pPr>
       <w:r>
-        <w:t xml:space="preserve">In the model we size the shortfall from deposits: if booked fares fell as much as realized fares (−5.6%), about 3 points fewer cabins are booked; if booked fares were flat, about 8. We use 5. We assume 20% of those cabins sail empty, about half of what the 2026 link between deposits and occupancy implies, and the rest sell late at NCL’s current close-in discount of about 25%. That puts 2027 occupancy (KPI 2) at 102.1%, down again from 2026 and a point below the consensus case, and takes about 0.9 points off 2H27 ticket price. The first test is the November 4 10-Q: September 30 advance ticket sales below $2.97B support this, and at $3.11B or more we would cover.</w:t>
+        <w:t xml:space="preserve">In the model we size the shortfall from deposits: if booked fares fell as much as realized fares, about 3 points fewer cabins are booked; if booked fares were flat, about 8. We use 5. We assume 20% of those cabins sail empty, about half of what the 2026 link between deposits and occupancy implies, and the rest sell late at NCL’s current close-in discount of about 25%. That puts 2027 occupancy (KPI 2) at 102.1%, a point below the consensus case, takes about 0.9 points off 2H27 ticket price and holds onboard spending growth to 2% against 3.5% (it fell 0.3% in 2025 and rose about 1% in 1H26).</w:t>
       </w:r>
     </w:p>
     <w:p>
@@ -338,7 +338,7 @@
               <w:t xml:space="preserve">From the data to the model: </w:t>
             </w:r>
             <w:r>
-              <w:t xml:space="preserve">Each data set moves one KPI, and each KPI is a line in our quarterly net yield build (net yield = occupancy × revenue per passenger day). The fare panel sets the price cut on unsold cabins (KPI 1); deposits set the booking shortfall, which shows up as empty cabins (KPI 2) and as late discounts on the rest. Together they take $137M off 2027 EBITDA (Exhibit 4). The rest of our gap to the consensus case is not part of either thesis: onboard spending grows 2% in our model (it fell 0.3% in 2025 and rose about 1% in 1H26) against 3.5%, and unit costs rise 1% against a 0.5% decline. On the two theses alone, the shares are worth about $13.50 (−10%).</w:t>
+              <w:t xml:space="preserve">Each data set moves one KPI in our quarterly net yield build (net yield = occupancy × revenue per passenger day). Our consensus case reproduces the Street’s 2027 revenue ($10.6B) and, at run-rate unit costs, its EBITDA ($2.68B against $2.69B). We use the same costs, so the whole $208M gap to our $2.47B is revenue that the fare panel and deposits point to (Exhibit 4). Consensus EPS needs more: unit costs falling 0.5% in 2027, worth another $107M, on top of the Street’s EBITDA.</w:t>
             </w:r>
           </w:p>
           <w:tbl>
@@ -385,7 +385,7 @@
                       <w:b/>
                       <w:sz w:val="15"/>
                     </w:rPr>
-                    <w:t xml:space="preserve">Alternative data → KPI (2027)</w:t>
+                    <w:t xml:space="preserve">Alternative data → model input</w:t>
                   </w:r>
                 </w:p>
               </w:tc>
@@ -446,6 +446,82 @@
                       <w:sz w:val="15"/>
                     </w:rPr>
                     <w:t xml:space="preserve">EBITDA ($M)</w:t>
+                  </w:r>
+                </w:p>
+              </w:tc>
+            </w:tr>
+            <w:tr>
+              <w:trPr>
+                <w:cantSplit/>
+              </w:trPr>
+              <w:tc>
+                <w:tcPr>
+                  <w:tcW w:w="2700" w:type="dxa"/>
+                  <w:vAlign w:val="center"/>
+                </w:tcPr>
+                <w:p>
+                  <w:pPr>
+                    <w:spacing w:after="0"/>
+                  </w:pPr>
+                  <w:r>
+                    <w:rPr>
+                      <w:sz w:val="15"/>
+                    </w:rPr>
+                    <w:t xml:space="preserve">Fare panel → 4Q26 net yield (exit rate)</w:t>
+                  </w:r>
+                </w:p>
+              </w:tc>
+              <w:tc>
+                <w:tcPr>
+                  <w:tcW w:w="1150" w:type="dxa"/>
+                  <w:vAlign w:val="center"/>
+                </w:tcPr>
+                <w:p>
+                  <w:pPr>
+                    <w:spacing w:after="0"/>
+                    <w:jc w:val="center"/>
+                  </w:pPr>
+                  <w:r>
+                    <w:rPr>
+                      <w:sz w:val="15"/>
+                    </w:rPr>
+                    <w:t xml:space="preserve">−6.0%</w:t>
+                  </w:r>
+                </w:p>
+              </w:tc>
+              <w:tc>
+                <w:tcPr>
+                  <w:tcW w:w="1150" w:type="dxa"/>
+                  <w:vAlign w:val="center"/>
+                </w:tcPr>
+                <w:p>
+                  <w:pPr>
+                    <w:spacing w:after="0"/>
+                    <w:jc w:val="center"/>
+                  </w:pPr>
+                  <w:r>
+                    <w:rPr>
+                      <w:sz w:val="15"/>
+                    </w:rPr>
+                    <w:t xml:space="preserve">−7.0%</w:t>
+                  </w:r>
+                </w:p>
+              </w:tc>
+              <w:tc>
+                <w:tcPr>
+                  <w:tcW w:w="1000" w:type="dxa"/>
+                  <w:vAlign w:val="center"/>
+                </w:tcPr>
+                <w:p>
+                  <w:pPr>
+                    <w:spacing w:after="0"/>
+                    <w:jc w:val="center"/>
+                  </w:pPr>
+                  <w:r>
+                    <w:rPr>
+                      <w:sz w:val="15"/>
+                    </w:rPr>
+                    <w:t xml:space="preserve">−29</w:t>
                   </w:r>
                 </w:p>
               </w:tc>
@@ -543,82 +619,6 @@
                     <w:rPr>
                       <w:sz w:val="15"/>
                     </w:rPr>
-                    <w:t xml:space="preserve">Deposits → KPI 2: occupancy</w:t>
-                  </w:r>
-                </w:p>
-              </w:tc>
-              <w:tc>
-                <w:tcPr>
-                  <w:tcW w:w="1150" w:type="dxa"/>
-                  <w:vAlign w:val="center"/>
-                </w:tcPr>
-                <w:p>
-                  <w:pPr>
-                    <w:spacing w:after="0"/>
-                    <w:jc w:val="center"/>
-                  </w:pPr>
-                  <w:r>
-                    <w:rPr>
-                      <w:sz w:val="15"/>
-                    </w:rPr>
-                    <w:t xml:space="preserve">103.1%</w:t>
-                  </w:r>
-                </w:p>
-              </w:tc>
-              <w:tc>
-                <w:tcPr>
-                  <w:tcW w:w="1150" w:type="dxa"/>
-                  <w:vAlign w:val="center"/>
-                </w:tcPr>
-                <w:p>
-                  <w:pPr>
-                    <w:spacing w:after="0"/>
-                    <w:jc w:val="center"/>
-                  </w:pPr>
-                  <w:r>
-                    <w:rPr>
-                      <w:sz w:val="15"/>
-                    </w:rPr>
-                    <w:t xml:space="preserve">102.1%</w:t>
-                  </w:r>
-                </w:p>
-              </w:tc>
-              <w:tc>
-                <w:tcPr>
-                  <w:tcW w:w="1000" w:type="dxa"/>
-                  <w:vAlign w:val="center"/>
-                </w:tcPr>
-                <w:p>
-                  <w:pPr>
-                    <w:spacing w:after="0"/>
-                    <w:jc w:val="center"/>
-                  </w:pPr>
-                  <w:r>
-                    <w:rPr>
-                      <w:sz w:val="15"/>
-                    </w:rPr>
-                    <w:t xml:space="preserve">−76</w:t>
-                  </w:r>
-                </w:p>
-              </w:tc>
-            </w:tr>
-            <w:tr>
-              <w:trPr>
-                <w:cantSplit/>
-              </w:trPr>
-              <w:tc>
-                <w:tcPr>
-                  <w:tcW w:w="2700" w:type="dxa"/>
-                  <w:vAlign w:val="center"/>
-                </w:tcPr>
-                <w:p>
-                  <w:pPr>
-                    <w:spacing w:after="0"/>
-                  </w:pPr>
-                  <w:r>
-                    <w:rPr>
-                      <w:sz w:val="15"/>
-                    </w:rPr>
                     <w:t xml:space="preserve">Deposits → KPI 1: 2H27 ticket price y/y</w:t>
                   </w:r>
                 </w:p>
@@ -695,7 +695,83 @@
                     <w:rPr>
                       <w:sz w:val="15"/>
                     </w:rPr>
-                    <w:t xml:space="preserve">Other: onboard spend per guest y/y</w:t>
+                    <w:t xml:space="preserve">Deposits → KPI 2: 2027 occupancy</w:t>
+                  </w:r>
+                </w:p>
+              </w:tc>
+              <w:tc>
+                <w:tcPr>
+                  <w:tcW w:w="1150" w:type="dxa"/>
+                  <w:vAlign w:val="center"/>
+                </w:tcPr>
+                <w:p>
+                  <w:pPr>
+                    <w:spacing w:after="0"/>
+                    <w:jc w:val="center"/>
+                  </w:pPr>
+                  <w:r>
+                    <w:rPr>
+                      <w:sz w:val="15"/>
+                    </w:rPr>
+                    <w:t xml:space="preserve">103.1%</w:t>
+                  </w:r>
+                </w:p>
+              </w:tc>
+              <w:tc>
+                <w:tcPr>
+                  <w:tcW w:w="1150" w:type="dxa"/>
+                  <w:vAlign w:val="center"/>
+                </w:tcPr>
+                <w:p>
+                  <w:pPr>
+                    <w:spacing w:after="0"/>
+                    <w:jc w:val="center"/>
+                  </w:pPr>
+                  <w:r>
+                    <w:rPr>
+                      <w:sz w:val="15"/>
+                    </w:rPr>
+                    <w:t xml:space="preserve">102.1%</w:t>
+                  </w:r>
+                </w:p>
+              </w:tc>
+              <w:tc>
+                <w:tcPr>
+                  <w:tcW w:w="1000" w:type="dxa"/>
+                  <w:vAlign w:val="center"/>
+                </w:tcPr>
+                <w:p>
+                  <w:pPr>
+                    <w:spacing w:after="0"/>
+                    <w:jc w:val="center"/>
+                  </w:pPr>
+                  <w:r>
+                    <w:rPr>
+                      <w:sz w:val="15"/>
+                    </w:rPr>
+                    <w:t xml:space="preserve">−76</w:t>
+                  </w:r>
+                </w:p>
+              </w:tc>
+            </w:tr>
+            <w:tr>
+              <w:trPr>
+                <w:cantSplit/>
+              </w:trPr>
+              <w:tc>
+                <w:tcPr>
+                  <w:tcW w:w="2700" w:type="dxa"/>
+                  <w:vAlign w:val="center"/>
+                </w:tcPr>
+                <w:p>
+                  <w:pPr>
+                    <w:spacing w:after="0"/>
+                  </w:pPr>
+                  <w:r>
+                    <w:rPr>
+                      <w:sz w:val="15"/>
+                    </w:rPr>
+                    <w:t xml:space="preserve">Both → onboard spend per guest y/y</w:t>
                   </w:r>
                 </w:p>
               </w:tc>
@@ -761,146 +837,6 @@
               <w:tc>
                 <w:tcPr>
                   <w:tcW w:w="2700" w:type="dxa"/>
-                  <w:vAlign w:val="center"/>
-                </w:tcPr>
-                <w:p>
-                  <w:pPr>
-                    <w:spacing w:after="0"/>
-                  </w:pPr>
-                  <w:r>
-                    <w:rPr>
-                      <w:sz w:val="15"/>
-                    </w:rPr>
-                    <w:t xml:space="preserve">Other: unit costs y/y / fuel per ton</w:t>
-                  </w:r>
-                </w:p>
-              </w:tc>
-              <w:tc>
-                <w:tcPr>
-                  <w:tcW w:w="1150" w:type="dxa"/>
-                  <w:vAlign w:val="center"/>
-                </w:tcPr>
-                <w:p>
-                  <w:pPr>
-                    <w:spacing w:after="0"/>
-                    <w:jc w:val="center"/>
-                  </w:pPr>
-                  <w:r>
-                    <w:rPr>
-                      <w:sz w:val="15"/>
-                    </w:rPr>
-                    <w:t xml:space="preserve">−0.5% / $760</w:t>
-                  </w:r>
-                </w:p>
-              </w:tc>
-              <w:tc>
-                <w:tcPr>
-                  <w:tcW w:w="1150" w:type="dxa"/>
-                  <w:vAlign w:val="center"/>
-                </w:tcPr>
-                <w:p>
-                  <w:pPr>
-                    <w:spacing w:after="0"/>
-                    <w:jc w:val="center"/>
-                  </w:pPr>
-                  <w:r>
-                    <w:rPr>
-                      <w:sz w:val="15"/>
-                    </w:rPr>
-                    <w:t xml:space="preserve">+1.0% / $800</w:t>
-                  </w:r>
-                </w:p>
-              </w:tc>
-              <w:tc>
-                <w:tcPr>
-                  <w:tcW w:w="1000" w:type="dxa"/>
-                  <w:vAlign w:val="center"/>
-                </w:tcPr>
-                <w:p>
-                  <w:pPr>
-                    <w:spacing w:after="0"/>
-                    <w:jc w:val="center"/>
-                  </w:pPr>
-                  <w:r>
-                    <w:rPr>
-                      <w:sz w:val="15"/>
-                    </w:rPr>
-                    <w:t xml:space="preserve">−107</w:t>
-                  </w:r>
-                </w:p>
-              </w:tc>
-            </w:tr>
-            <w:tr>
-              <w:trPr>
-                <w:cantSplit/>
-              </w:trPr>
-              <w:tc>
-                <w:tcPr>
-                  <w:tcW w:w="2700" w:type="dxa"/>
-                  <w:vAlign w:val="center"/>
-                </w:tcPr>
-                <w:p>
-                  <w:pPr>
-                    <w:spacing w:after="0"/>
-                  </w:pPr>
-                  <w:r>
-                    <w:rPr>
-                      <w:sz w:val="15"/>
-                    </w:rPr>
-                    <w:t xml:space="preserve">2H26 exit rate</w:t>
-                  </w:r>
-                </w:p>
-              </w:tc>
-              <w:tc>
-                <w:tcPr>
-                  <w:tcW w:w="1150" w:type="dxa"/>
-                  <w:vAlign w:val="center"/>
-                </w:tcPr>
-                <w:p>
-                  <w:pPr>
-                    <w:spacing w:after="0"/>
-                    <w:jc w:val="center"/>
-                  </w:pPr>
-                </w:p>
-              </w:tc>
-              <w:tc>
-                <w:tcPr>
-                  <w:tcW w:w="1150" w:type="dxa"/>
-                  <w:vAlign w:val="center"/>
-                </w:tcPr>
-                <w:p>
-                  <w:pPr>
-                    <w:spacing w:after="0"/>
-                    <w:jc w:val="center"/>
-                  </w:pPr>
-                </w:p>
-              </w:tc>
-              <w:tc>
-                <w:tcPr>
-                  <w:tcW w:w="1000" w:type="dxa"/>
-                  <w:vAlign w:val="center"/>
-                </w:tcPr>
-                <w:p>
-                  <w:pPr>
-                    <w:spacing w:after="0"/>
-                    <w:jc w:val="center"/>
-                  </w:pPr>
-                  <w:r>
-                    <w:rPr>
-                      <w:sz w:val="15"/>
-                    </w:rPr>
-                    <w:t xml:space="preserve">−29</w:t>
-                  </w:r>
-                </w:p>
-              </w:tc>
-            </w:tr>
-            <w:tr>
-              <w:trPr>
-                <w:cantSplit/>
-              </w:trPr>
-              <w:tc>
-                <w:tcPr>
-                  <w:tcW w:w="2700" w:type="dxa"/>
                   <w:shd w:val="clear" w:color="auto" w:fill="F2F2F2"/>
                   <w:vAlign w:val="center"/>
                 </w:tcPr>
@@ -913,7 +849,7 @@
                       <w:b/>
                       <w:sz w:val="15"/>
                     </w:rPr>
-                    <w:t xml:space="preserve">2027 EBITDA</w:t>
+                    <w:t xml:space="preserve">2027 EBITDA (run-rate unit costs in both)</w:t>
                   </w:r>
                 </w:p>
               </w:tc>
@@ -933,7 +869,7 @@
                       <w:b/>
                       <w:sz w:val="15"/>
                     </w:rPr>
-                    <w:t xml:space="preserve">$2.79B</w:t>
+                    <w:t xml:space="preserve">$2.68B</w:t>
                   </w:r>
                 </w:p>
               </w:tc>
@@ -973,7 +909,7 @@
                       <w:b/>
                       <w:sz w:val="15"/>
                     </w:rPr>
-                    <w:t xml:space="preserve">−315</w:t>
+                    <w:t xml:space="preserve">−208</w:t>
                   </w:r>
                 </w:p>
               </w:tc>
@@ -1056,7 +992,7 @@
         <w:t xml:space="preserve">Valuation and risk/reward: </w:t>
       </w:r>
       <w:r>
-        <w:t xml:space="preserve">We value NCLH on 2027 EBITDA at today’s 8.4x forward multiple, less $15.8B of year-end net debt. Our $2.47B gives $10.83 a share (−28%), and a DCF of 2027–30 cash flows gives $8.11. Leverage widens the range of outcomes: each point of 2027 ticket price is worth about $0.90 a share and each point of occupancy about $1.40. If consensus is right and the stock re-rates to 9x, it is worth about $19.90 (+32%); if discounting spreads into 2H27, about $6.30 (−58%). Weighted 25/50/25, value is about $12 (−21%). Net debt also keeps rising in our model, to $17.7B (7.2x EBITDA) at the end of 2027, as newbuild payments continue.</w:t>
+        <w:t xml:space="preserve">We value NCLH on 2027 EBITDA at today’s 8.5x forward multiple, less $15.9B of year-end net debt. Our $2.47B gives $10.82 a share (−28%), and a DCF of 2027–30 cash flows gives $8.26. Each point of 2027 ticket price is worth about $0.90 a share and each point of occupancy about $1.40. If consensus EPS is right, which needs the Street’s revenue and falling unit costs, and the stock re-rates to 9x, it is worth about $19.70 (+31%); if discounting spreads into 2H27, about $6.20 (−59%). Weighted 25/50/25, value is about $11.90 (−21%). The multiple is the main valuation risk: at 9.0x our EBITDA is worth about $13.70 (−9%). We use today’s multiple because NCLH’s has moved with net yield, falling from 10.0x to 8.7x between September 2025 and March 2026 as net yield turned negative. If cost savings let unit costs fall 0.5%, value rises to about $12.80 (−15%).</w:t>
       </w:r>
     </w:p>
     <w:tbl>
@@ -1248,7 +1184,7 @@
               <w:rPr>
                 <w:sz w:val="15"/>
               </w:rPr>
-              <w:t xml:space="preserve">Bull: consensus is right and the stock re-rates</w:t>
+              <w:t xml:space="preserve">Bull: consensus EPS is right and the stock re-rates</w:t>
             </w:r>
           </w:p>
         </w:tc>
@@ -1338,7 +1274,7 @@
               <w:rPr>
                 <w:sz w:val="15"/>
               </w:rPr>
-              <w:t xml:space="preserve">$19.92</w:t>
+              <w:t xml:space="preserve">$19.74</w:t>
             </w:r>
           </w:p>
         </w:tc>
@@ -1356,7 +1292,7 @@
               <w:rPr>
                 <w:sz w:val="15"/>
               </w:rPr>
-              <w:t xml:space="preserve">+32%</w:t>
+              <w:t xml:space="preserve">+31%</w:t>
             </w:r>
           </w:p>
         </w:tc>
@@ -1450,7 +1386,7 @@
               <w:rPr>
                 <w:sz w:val="15"/>
               </w:rPr>
-              <w:t xml:space="preserve">8.4x</w:t>
+              <w:t xml:space="preserve">8.5x</w:t>
             </w:r>
           </w:p>
         </w:tc>
@@ -1468,7 +1404,7 @@
               <w:rPr>
                 <w:sz w:val="15"/>
               </w:rPr>
-              <w:t xml:space="preserve">$10.83</w:t>
+              <w:t xml:space="preserve">$10.82</w:t>
             </w:r>
           </w:p>
         </w:tc>
@@ -1580,7 +1516,7 @@
               <w:rPr>
                 <w:sz w:val="15"/>
               </w:rPr>
-              <w:t xml:space="preserve">8.4x</w:t>
+              <w:t xml:space="preserve">8.5x</w:t>
             </w:r>
           </w:p>
         </w:tc>
@@ -1598,7 +1534,7 @@
               <w:rPr>
                 <w:sz w:val="15"/>
               </w:rPr>
-              <w:t xml:space="preserve">$6.27</w:t>
+              <w:t xml:space="preserve">$6.24</w:t>
             </w:r>
           </w:p>
         </w:tc>
@@ -1616,7 +1552,7 @@
               <w:rPr>
                 <w:sz w:val="15"/>
               </w:rPr>
-              <w:t xml:space="preserve">−58%</w:t>
+              <w:t xml:space="preserve">−59%</w:t>
             </w:r>
           </w:p>
         </w:tc>
@@ -1712,7 +1648,7 @@
                 <w:b/>
                 <w:sz w:val="15"/>
               </w:rPr>
-              <w:t xml:space="preserve">$11.96</w:t>
+              <w:t xml:space="preserve">$11.90</w:t>
             </w:r>
           </w:p>
         </w:tc>
@@ -1756,26 +1692,10 @@
         <w:rPr>
           <w:b/>
         </w:rPr>
-        <w:t xml:space="preserve">When we would cover: </w:t>
+        <w:t xml:space="preserve">Catalysts and when we would cover: </w:t>
       </w:r>
       <w:r>
-        <w:t xml:space="preserve">We would close the position if the data turns against us, whatever the price: September 30 advance ticket sales of $3.11B or more, a fare-panel re-run showing NCL’s 1H27 Caribbean cuts back near Royal’s and Carnival’s, or a February guide for 2027 net yield above +1%. On price, we would take most of the position off near $11, where the stock prices our base case and the remaining downside no longer pays for the squeeze risk.</w:t>
-      </w:r>
-    </w:p>
-    <w:p>
-      <w:pPr>
-        <w:widowControl/>
-        <w:spacing w:before="40" w:after="40"/>
-        <w:jc w:val="both"/>
-      </w:pPr>
-      <w:r>
-        <w:rPr>
-          <w:b/>
-        </w:rPr>
-        <w:t xml:space="preserve">Catalysts: </w:t>
-      </w:r>
-      <w:r>
-        <w:t xml:space="preserve">November 4 (3Q26 results): earnings should beat ($0.90 guided against $0.83 consensus), so the number to watch is September 30 advance ticket sales, which we expect at $2.94B (−7% y/y). A beat on 3Q26 does not test the thesis, because those cruises were sold before the cuts. Late February: the first 2027 guide, which we expect at or below flat net yield against +1.6% in the consensus case. Monthly: our fare-panel re-run on 1H27 sailings. May 2027 (1Q27 results): we model occupancy of 101.8% and ticket price per passenger day down 2.8%.</w:t>
+        <w:t xml:space="preserve">November 4 (3Q26): earnings should beat ($0.90 guided against $0.83), but those cruises were sold before the cuts; the number to watch is September 30 advance ticket sales, which we expect at $2.94B (−7% y/y). Late February: the first 2027 guide, which we expect at or below flat net yield against +1.6% in the consensus case. May 2027: 1Q27 results, where we model occupancy of 101.8% and ticket price per passenger day down 2.8%. We would cover on the data, whatever the price: advance ticket sales of $3.11B or more, a fare-panel re-run showing NCL’s 1H27 Caribbean cuts back near peers’, or a 2027 guide above +1%.</w:t>
       </w:r>
     </w:p>
     <w:p>
@@ -1791,7 +1711,7 @@
         <w:t xml:space="preserve">Risks and sizing: </w:t>
       </w:r>
       <w:r>
-        <w:t xml:space="preserve">The main risk is a squeeze. 95M shares are short (5.7 days to cover), and the stock rose 48% in six weeks this spring when oil fell. About half of NCLH’s moves follow oil and its peers, so we would start with a third of the position, add on oil- or ceasefire-driven rallies and around November 4 and February, hold part of it in puts, and stop out above $19, where shorts added at about $18 are under water and the bull case begins. Other risks: Elliott’s standstill ends in February, cost savings beyond the $225M identified would offset our cost assumption, and the fare panel is a snapshot, so the cuts could reverse. We could also be early: in this cycle deposits turned down about a year before net yield did, so the 2027 shortfall may show up later than our quarterly path assumes.</w:t>
+        <w:t xml:space="preserve">The main risk is a squeeze. 95M shares are short (5.7 days to cover), and the stock rose 48% in six weeks this spring when oil fell. About half of NCLH’s moves follow oil and its peers, so we would start with a third of the position, add on oil- or ceasefire-driven rallies and around November 4 and February, hold part of it in puts, and stop out above $19, where shorts added at about $18 are under water and the bull case begins. Elliott could push for a sale, though net debt above 5x EBITDA makes a buyout hard to finance. We could also be early: in this cycle deposits turned about a year before net yield.</w:t>
       </w:r>
     </w:p>
     <w:p>

</xml_diff>

<commit_message>
Narrative summary: state the two qualitative reasons and the data behind each
Co-Authored-By: Claude Opus 5.5 <noreply@anthropic.com>
Claude-Session: https://claude.ai/code/session_01XEymX7iPffNP52qHnJAtAJ
</commit_message>
<xml_diff>
--- a/NCLH_memo_v13.docx
+++ b/NCLH_memo_v13.docx
@@ -15,7 +15,7 @@
         <w:t xml:space="preserve">Narrative Summary: </w:t>
       </w:r>
       <w:r>
-        <w:t xml:space="preserve">Recommendation: short NCLH at $15.05, starting at a third of a full position. Our base case is worth about $10.80 (−28%) and the probability-weighted value about $11.90 (−21%). The market prices NCLH on net yield (ticket and onboard revenue, less commissions and onboard costs, per available berth-day), and the share price assumes net yield climbs back above its 2025 level. We think it falls again in 2027, and two sets of alternative data show why. A fare panel of 4,783 itineraries shows NCL cutting Caribbean fares where it is losing share to Royal Caribbean and Carnival; applied to the cabins NCL still has to sell, that lowers ticket price per passenger day (KPI 1). NCL’s deposits show a booking shortfall that its Best Price Guarantee gives guests no reason to close, and since COVID deposits have reached net yield about four quarters later; that lowers 2027 occupancy (KPI 2) and keeps 2H27 prices from recovering. Our 2027 EBITDA of $2.47B is $221M below the Street’s $2.69B, and the two data sets account for almost all of that gap: lower ticket prices and occupancy, plus the lower onboard spending of guests won with discounts. Our EPS is $0.95; consensus of $1.46–1.67 is further off because it has not absorbed the September interest guide.</w:t>
+        <w:t xml:space="preserve">Recommendation: short NCLH at $15.05, starting at a third of a full position. Our base case is worth about $10.80 (−28%) and the probability-weighted value about $11.90 (−21%). The market prices NCLH on net yield (ticket and onboard revenue, less commissions and onboard costs, per available berth-day), and the share price assumes net yield climbs back above its 2025 level. We think it falls again in 2027, for two reasons. First, NCL is losing the Caribbean to Royal Caribbean and Carnival, whose private islands and ships fill at full price, so NCL has to fill its ships by cutting fares; this is competition, not the war, and its own new island and ships have not fixed it. Our scrape of 4,783 itineraries from a public fare tracker shows NCL’s 1H27 Caribbean fares down 14.5% while its rivals hold theirs, which lowers ticket price per passenger day (KPI 1). Second, NCL’s Best Price Guarantee gives guests no reason to book early, so management’s plan to rebuild prices by selling cabins early will not work. NCL’s deposits, from its SEC filings, already show the booking shortfall, and since COVID deposits have reached net yield about four quarters later; that lowers 2027 occupancy (KPI 2) and keeps 2H27 prices down. Our 2027 EBITDA of $2.47B is $221M below the Street’s $2.69B, and these two reasons account for almost all of the gap. Our EPS is $0.95; consensus of $1.46–1.67 is further off because it has not absorbed the September interest guide.</w:t>
       </w:r>
     </w:p>
     <w:p>
@@ -112,7 +112,7 @@
         <w:t xml:space="preserve">Market Expectations: </w:t>
       </w:r>
       <w:r>
-        <w:t xml:space="preserve">Since 2024 NCLH’s EV/EBITDA has tracked net yield growth closely (r = 0.87 over ten quarters), and on the four days management changed its yield outlook the stock lost 27 points against Royal and Carnival. Working back from the $21.7B enterprise value at a 9% WACC, the price needs about $3.0B of steady-state EBITDA, which is management’s March guide and net yield back above its 2025 level (Exhibit 1). The Street is less demanding but still expects a recovery: it models 2027 revenue of $10.6B and EBITDA of $2.69B, and the $18.80 average target needs $2.9B. At 8.1x trailing EBITDA the stock looks cheap against 10.9x in 2016–19, but that multiple sits on EBITDA we expect to fall.</w:t>
+        <w:t xml:space="preserve">Since 2024 NCLH’s EV/EBITDA has tracked net yield growth closely (r = 0.87 over ten quarters), and on the four days management changed its yield outlook the stock lost 27 points against Royal and Carnival. Working back from the $21.7B enterprise value at a 9% WACC, the price needs about $3.0B of steady-state EBITDA, which is management’s March guide and net yield back above its 2025 level (Exhibit 1). The Street is less demanding but still expects a recovery: it models 2027 revenue of $10.6B and EBITDA of $2.69B, and the $18.80 average target needs $2.9B.</w:t>
       </w:r>
     </w:p>
     <w:p>

</xml_diff>

<commit_message>
Weave the thesis-to-KPI logic through the memo text
Market Expectations frames the debate as two KPIs, each thesis heading names
the KPI it moves, and each thesis's model paragraph opens with how that thesis
reaches its KPI. Light trims keep the memo at two pages.

Co-Authored-By: Claude Opus 5.5 <noreply@anthropic.com>
Claude-Session: https://claude.ai/code/session_01XEymX7iPffNP52qHnJAtAJ
</commit_message>
<xml_diff>
--- a/NCLH_memo_v13.docx
+++ b/NCLH_memo_v13.docx
@@ -47,7 +47,7 @@
         <w:t xml:space="preserve">Industry Overview: </w:t>
       </w:r>
       <w:r>
-        <w:t xml:space="preserve">Carnival (about 32% of capacity), Royal Caribbean (26%), MSC and NCLH (about 10% each) carry about 80% of the market. Demand is healthy overall: Carnival’s deposits are up 6.5% on flat capacity and Royal’s are up 5.6%. The competition is in the Caribbean, where each large line now sells a private island, and NCL arrived with the most new capacity and the last island to be finished (September 2026). Returns differ: 2025 return on capital was about 16% at Royal and 12% at Carnival, against about 10% at NCLH, close to its cost of capital.</w:t>
+        <w:t xml:space="preserve">Carnival (about 32% of capacity), Royal Caribbean (26%), MSC and NCLH (about 10% each) carry about 80% of the market. Demand is healthy overall: Carnival’s deposits are up 6.5% on flat capacity and Royal’s are up 5.6%. The competition is in the Caribbean, where each large line now sells a private island, and NCL arrived with the most new capacity and the last island to be finished (September 2026). 2025 return on capital was about 16% at Royal and 12% at Carnival, against 10% at NCLH.</w:t>
       </w:r>
     </w:p>
     <w:p>
@@ -112,7 +112,7 @@
         <w:t xml:space="preserve">Market Expectations: </w:t>
       </w:r>
       <w:r>
-        <w:t xml:space="preserve">Since 2024 NCLH’s EV/EBITDA has tracked net yield growth closely (r = 0.87 over ten quarters), and on the four days management changed its yield outlook the stock lost 27 points against Royal and Carnival. Working back from the $21.7B enterprise value at a 9% WACC, the price needs about $3.0B of steady-state EBITDA, which is management’s March guide and net yield back above its 2025 level (Exhibit 1). The Street is less demanding but still expects a recovery: it models 2027 revenue of $10.6B and EBITDA of $2.69B, and the $18.80 average target needs $2.9B.</w:t>
+        <w:t xml:space="preserve">Since 2024 NCLH’s EV/EBITDA has tracked net yield growth closely (r = 0.87 over ten quarters), and on the four days management changed its yield outlook the stock lost 27 points against Royal and Carnival. Working back from the $21.7B enterprise value at a 9% WACC, the price needs about $3.0B of steady-state EBITDA, which is management’s March guide and net yield back above its 2025 level (Exhibit 1). The Street is less demanding but still expects a recovery: it models 2027 revenue of $10.6B and EBITDA of $2.69B, and the $18.80 average target needs $2.9B. Since net yield is occupancy times revenue per passenger day, the debate comes down to two KPIs: ticket price per passenger day (KPI 1), which the consensus case has stabilizing, and occupancy (KPI 2), which it has recovering by a point in 2027. Each thesis goes against one of them.</w:t>
       </w:r>
     </w:p>
     <w:p>
@@ -122,7 +122,7 @@
         <w:jc w:val="both"/>
       </w:pPr>
       <w:r>
-        <w:t xml:space="preserve">Sentiment has turned faster than estimates. Ratings are 4 Buy, 15 Hold and 0 Sell (11, 4 and 0 a year ago) and short interest is 20.7% of float, yet consensus 2027 EPS moved only two cents when NCLH guided 2027 interest $0.35 a share higher on September 30; at the Street’s own EBITDA and the guided interest, EPS is about $1.41. The bull argument is that the selloff was oil and the sector. Our regression puts 54% of the decline there, but NCLH moved no more than Carnival on the biggest oil days, and the NCL-specific 46% came on six company news days and did not reverse.</w:t>
+        <w:t xml:space="preserve">Sentiment has turned faster than estimates. Ratings are 4 Buy, 15 Hold, 0 Sell and short interest is 20.7% of float, yet consensus 2027 EPS moved only two cents when NCLH guided 2027 interest $0.35 a share higher on September 30; at the Street’s own EBITDA and the guided interest, EPS is about $1.41. The bull argument is that the selloff was oil and the sector. Our regression puts 54% of the decline there, but NCLH moved no more than Carnival on the biggest oil days, and the NCL-specific 46% came on six company news days and did not reverse.</w:t>
       </w:r>
     </w:p>
     <w:p>
@@ -145,7 +145,7 @@
             <wp:positionV relativeFrom="paragraph">
               <wp:posOffset>0</wp:posOffset>
             </wp:positionV>
-            <wp:extent cx="2560320" cy="1945843"/>
+            <wp:extent cx="2377440" cy="1806854"/>
             <wp:effectExtent l="0" t="0" r="0" b="0"/>
             <wp:wrapSquare wrapText="left"/>
             <wp:docPr id="102" name="ex2"/>
@@ -168,7 +168,7 @@
                   <pic:spPr>
                     <a:xfrm>
                       <a:off x="0" y="0"/>
-                      <a:ext cx="2560320" cy="1945843"/>
+                      <a:ext cx="2377440" cy="1806854"/>
                     </a:xfrm>
                     <a:prstGeom prst="rect">
                       <a:avLst/>
@@ -184,10 +184,10 @@
         <w:rPr>
           <w:b/>
         </w:rPr>
-        <w:t xml:space="preserve">Thesis 1: NCL is cutting prices because it is losing share in the Caribbean, and the cuts reach 1H27 revenue. </w:t>
+        <w:t xml:space="preserve">Thesis 1: NCL is cutting prices because it is losing share in the Caribbean, which keeps ticket price per passenger day (KPI 1) falling. </w:t>
       </w:r>
       <w:r>
-        <w:t xml:space="preserve">The Street reads the discounting as a result of the war and of execution problems that the finished island and new ships will fix in 2027. We think the cause is competition. Every large line added Caribbean ships and a private island at the same time, and because a ship costs about the same to sail full or empty, the line with the weakest product fills its ships by cutting price. The fare data fits that. On October 2 we compared the lowest fare on 4,783 itineraries with each one’s 90-day average. NCL has cut 1H27 Caribbean sailings by a median 14.5% but Europe by only 2%, although two-thirds of its European guests fly in and face higher airfares. Royal and Carnival, which also added Caribbean ships, have held Caribbean prices and are discounting Europe instead (Exhibit 2). If the war were the cause, we would expect the opposite pattern. The cuts are also recent. NCL cut prices less often than Royal in 2025, but it went from 1 to 9 of the industry’s 10 largest monthly price cuts between December and October. The new product has not stopped them: sailings that call at NCL’s island are cut as much as its other Caribbean sailings, and its newest ships are cut 22% against 1% for Royal’s newest. NCL now prices below the budget brand: from Port Canaveral in 1H27 its lowest fare is $94 a night against $100 at Carnival and $118 at Royal, and 71% of its Caribbean itineraries sit at record-low fares against 45% at both rivals. Oceania and Regent show no cuts, so the problem is the NCL brand.</w:t>
+        <w:t xml:space="preserve">The Street reads the discounting as a result of the war and of execution problems that the finished island and new ships will fix in 2027. We think the cause is competition. Every large line added Caribbean ships and a private island at the same time, and because a ship costs about the same to sail full or empty, the line with the weakest product fills its ships by cutting price. The fare data fits that. On October 2 we compared the lowest fare on 4,783 itineraries with each one’s 90-day average. NCL has cut 1H27 Caribbean sailings by a median 14.5% but Europe by only 2%, although two-thirds of its European guests fly in and face higher airfares. Royal and Carnival, which also added Caribbean ships, have held Caribbean prices and are discounting Europe instead (Exhibit 2). If the war were the cause, we would expect the opposite pattern. The cuts are also recent. NCL cut prices less often than Royal in 2025, but it went from 1 to 9 of the industry’s 10 largest monthly price cuts between December and October. The new product has not stopped them: sailings that call at NCL’s island are cut as much as its other Caribbean sailings, and its newest ships are cut 22% against 1% for Royal’s newest. NCL now prices below the budget brand: from Port Canaveral in 1H27 its lowest fare is $94 a night against $100 at Carnival. Oceania and Regent show no cuts, so the problem is the NCL brand.</w:t>
       </w:r>
     </w:p>
     <w:p>
@@ -197,7 +197,7 @@
         <w:jc w:val="both"/>
       </w:pPr>
       <w:r>
-        <w:t xml:space="preserve">Lowest fares are not realized prices, but realized prices are moving the same way: NCLH’s ticket revenue per passenger day fell 5.6% in 1H26. For the model, the cuts matter only for cabins NCL has not yet sold. With a normal booking curve and the booking shortfall from Thesis 2, about 45% of 1Q27 and 55% of 2Q27 cabins are still unsold, and 74% of NCL-brand capacity sails in the Caribbean in 1Q27. We weight the NCL brand at 65% of ticket revenue: if Oceania and Regent sell near their lowest fares, as all-suite ships tend to, NCL must make up about 66% of the $265 of ticket revenue per passenger day NCLH reported for 2025. That takes 1H27 ticket price (KPI 1) to −2.6% y/y against −1.1% in the consensus case. The same data, with Q4 sailings cut 36%, puts 4Q26 net yield at −7.0%, half a point below the implied guide. The main risk is that the cuts reverse before guests book; we re-run the fare panel monthly.</w:t>
+        <w:t xml:space="preserve">From Thesis 1 to KPI 1: lowest fares are not realized prices, but realized prices are moving the same way (NCLH’s ticket revenue per passenger day fell 5.6% in 1H26), and the cuts matter only for cabins NCL has not yet sold. With a normal booking curve and the booking shortfall from Thesis 2, about 45% of 1Q27 and 55% of 2Q27 cabins are still unsold, and 74% of NCL-brand capacity sails in the Caribbean in 1Q27. We weight the NCL brand at 65% of ticket revenue: if Oceania and Regent sell near their lowest fares, as all-suite ships tend to, NCL must make up about 66% of the $265 of ticket revenue per passenger day NCLH reported for 2025. That takes 1H27 ticket price (KPI 1) to −2.6% y/y against −1.1% in the consensus case. The same data, with Q4 sailings cut 36%, puts 4Q26 net yield at −7.0%, half a point below the implied guide. The main risk is that the cuts reverse before guests book; we re-run the fare panel monthly.</w:t>
       </w:r>
     </w:p>
     <w:p>
@@ -210,7 +210,7 @@
         <w:rPr>
           <w:b/>
         </w:rPr>
-        <w:t xml:space="preserve">Thesis 2: NCL’s booking shortfall is already in its deposits, and deposits reach net yield about a year later. </w:t>
+        <w:t xml:space="preserve">Thesis 2: NCL’s booking shortfall is already in its deposits and reaches net yield about a year later, which holds down occupancy (KPI 2). </w:t>
       </w:r>
       <w:r>
         <w:t xml:space="preserve">The consensus case has net yield up about 3% in 2H27, helped by easy comparisons and by base-loading: opening sailings at lower fares and raising them as ships fill. That needs guests who book early because they expect prices to rise. NCL’s Best Price Guarantee removes the reason to: before final payment a booked guest can move to any lower fare, and after it a guest on a cruise of six nights or more gets an upgrade or future-cruise credit for the difference, while Royal offers nothing after final payment. NCL has also shown guests that it cuts late: 77% of its 4Q26 Caribbean sailings of seven nights or more have been cut 20% or more. Filling ships late with price has costs beyond the fare: in 1Q26 occupancy rose 2.3 points, but net yield still fell 1.0% and onboard revenue per passenger day fell 2.9%, because guests who buy on discount spend less on board.</w:t>
@@ -236,7 +236,7 @@
             <wp:positionV relativeFrom="paragraph">
               <wp:posOffset>0</wp:posOffset>
             </wp:positionV>
-            <wp:extent cx="2377440" cy="1854403"/>
+            <wp:extent cx="2286000" cy="1783080"/>
             <wp:effectExtent l="0" t="0" r="0" b="0"/>
             <wp:wrapSquare wrapText="left"/>
             <wp:docPr id="103" name="ex3"/>
@@ -259,7 +259,7 @@
                   <pic:spPr>
                     <a:xfrm>
                       <a:off x="0" y="0"/>
-                      <a:ext cx="2377440" cy="1854403"/>
+                      <a:ext cx="2286000" cy="1783080"/>
                     </a:xfrm>
                     <a:prstGeom prst="rect">
                       <a:avLst/>
@@ -272,7 +272,7 @@
         </w:drawing>
       </w:r>
       <w:r>
-        <w:t xml:space="preserve">The shortfall is already visible. Deposits per future berth-day are down 8.3% y/y, the seventh decline in a row, while Royal’s and Carnival’s are growing, and NCL says it is “below its optimal booked position for the next 12 months.” This is not a shift to shorter cruises, which book later: about a third of 4Q26 Caribbean itineraries are 3–5 nights at NCL, Royal and Carnival alike, and NCL is cutting both lengths. The lag from deposits to net yield is also predictable. Guests pay deposits when they book, so deposits move first. Before COVID the lead was one to two quarters. Since COVID guests book further ahead (advance ticket sales are about a third of annual revenue, against a quarter in 2016–18), and the lead has stretched to about four quarters: deposits turned negative in December 2024 and net yield followed in 1Q26. At a four-quarter lead the indicator has called the direction of net yield in 5 of 6 reported quarters, and the 3Q26 guide and 4Q26 implied figure fit as well (Exhibit 3). On that lag, the March and June readings fall on 1Q27 and 2Q27, the quarters consensus expects to recover. A simple fit over those eight quarters points to 1H27 net yield of about −4%, against −2.6% in our model and −0.2% in the consensus case.</w:t>
+        <w:t xml:space="preserve">The shortfall is already visible. Deposits per future berth-day are down 8.3% y/y, the seventh decline in a row, while Royal’s and Carnival’s are growing, and NCL says it is “below its optimal booked position for the next 12 months.” This is not a shift to shorter cruises, which book later: about a third of 4Q26 Caribbean itineraries are 3–5 nights at NCL, Royal and Carnival alike. The lag from deposits to net yield is also predictable. Guests pay deposits when they book, so deposits move first. Before COVID the lead was one to two quarters. Since COVID guests book further ahead (advance ticket sales are about a third of annual revenue, against a quarter in 2016–18), and the lead has stretched to about four quarters: deposits turned negative in December 2024 and net yield followed in 1Q26. At a four-quarter lead the indicator has called the direction of net yield in 5 of 6 reported quarters, and the 3Q26 guide and 4Q26 implied figure fit as well (Exhibit 3). On that lag, the March and June readings fall on 1Q27 and 2Q27, the quarters consensus expects to recover. A simple fit over those eight quarters points to 1H27 net yield of about −4%, against −2.6% in our model and −0.2% in the consensus case.</w:t>
       </w:r>
     </w:p>
     <w:p>
@@ -282,7 +282,7 @@
         <w:jc w:val="both"/>
       </w:pPr>
       <w:r>
-        <w:t xml:space="preserve">In the model we size the shortfall from deposits: if booked fares fell as much as realized fares, about 3 points fewer cabins are booked; if booked fares were flat, about 8. We use 5. We assume 20% of those cabins sail empty, about half of what the 2026 link between deposits and occupancy implies, and the rest sell late at NCL’s current close-in discount of about 25%. That puts 2027 occupancy (KPI 2) at 102.1%, a point below the consensus case, takes about 0.9 points off 2H27 ticket price and holds onboard spending growth to 2% against 3.5% (it fell 0.3% in 2025 and rose about 1% in 1H26).</w:t>
+        <w:t xml:space="preserve">From Thesis 2 to KPI 2: we size the shortfall from deposits: if booked fares fell as much as realized fares, about 3 points fewer cabins are booked; if booked fares were flat, about 8. We use 5. We assume 20% of those cabins sail empty, about half of what the 2026 link between deposits and occupancy implies, and the rest sell late at NCL’s current close-in discount of about 25%. That puts 2027 occupancy (KPI 2) at 102.1%, a point below the consensus case, takes about 0.9 points off 2H27 ticket price and holds onboard spending growth to 2% against 3.5% (it fell 0.3% in 2025 and rose about 1% in 1H26).</w:t>
       </w:r>
     </w:p>
     <w:p>
@@ -338,7 +338,7 @@
               <w:t xml:space="preserve">From the data to the model: </w:t>
             </w:r>
             <w:r>
-              <w:t xml:space="preserve">Each data set moves one KPI in our quarterly net yield build (net yield = occupancy × revenue per passenger day). Our consensus case reproduces the Street’s 2027 revenue ($10.6B) and, at run-rate unit costs, its EBITDA ($2.68B against $2.69B). We use the same costs, so the whole $208M gap to our $2.47B is revenue that the fare panel and deposits point to (Exhibit 4). Consensus EPS needs more: unit costs falling 0.5% in 2027, worth another $107M, on top of the Street’s EBITDA.</w:t>
+              <w:t xml:space="preserve">Each thesis moves one KPI in our quarterly net yield build (net yield = occupancy × revenue per passenger day): the fare panel sets the price cut on unsold cabins (KPI 1), and deposits set the booking shortfall, which shows up as empty cabins (KPI 2) and late discounts. Our consensus case reproduces the Street’s 2027 revenue ($10.6B) and, at run-rate unit costs, its EBITDA ($2.68B against $2.69B). We use the same costs, so the whole $208M gap to our $2.47B comes from the two theses (Exhibit 4). Consensus EPS needs more: unit costs falling 0.5% in 2027, worth another $107M.</w:t>
             </w:r>
           </w:p>
           <w:tbl>
@@ -992,7 +992,7 @@
         <w:t xml:space="preserve">Valuation and risk/reward: </w:t>
       </w:r>
       <w:r>
-        <w:t xml:space="preserve">We value NCLH on 2027 EBITDA at today’s 8.5x forward multiple, less $15.9B of year-end net debt. Our $2.47B gives $10.82 a share (−28%), and a DCF of 2027–30 cash flows gives $8.26. Each point of 2027 ticket price is worth about $0.90 a share and each point of occupancy about $1.40. If consensus EPS is right, which needs the Street’s revenue and falling unit costs, and the stock re-rates to 9x, it is worth about $19.70 (+31%); if discounting spreads into 2H27, about $6.20 (−59%). Weighted 25/50/25, value is about $11.90 (−21%). The multiple is the main valuation risk: at 9.0x our EBITDA is worth about $13.70 (−9%). We use today’s multiple because NCLH’s has moved with net yield, falling from 10.0x to 8.7x between September 2025 and March 2026 as net yield turned negative. If cost savings let unit costs fall 0.5%, value rises to about $12.80 (−15%).</w:t>
+        <w:t xml:space="preserve">We value NCLH on 2027 EBITDA at today’s 8.5x forward multiple, less $15.9B of year-end net debt. Our $2.47B gives $10.82 a share (−28%), and a DCF of 2027–30 cash flows gives $8.26. Each point of 2027 ticket price is worth about $0.90 a share and each point of occupancy about $1.40. If consensus EPS is right (Street revenue plus falling unit costs) and the stock re-rates to 9x, it is worth about $19.70 (+31%); if discounting spreads into 2H27, about $6.20 (−59%). Weighted 25/50/25, value is about $11.90 (−21%). The multiple is the main valuation risk: at 9.0x our EBITDA is worth about $13.70 (−9%). We use today’s because NCLH’s multiple has fallen with net yield (10.0x to 8.7x from September 2025 to March 2026). If cost savings let unit costs fall 0.5%, value rises to about $12.80 (−15%).</w:t>
       </w:r>
     </w:p>
     <w:tbl>
@@ -1695,7 +1695,7 @@
         <w:t xml:space="preserve">Catalysts and when we would cover: </w:t>
       </w:r>
       <w:r>
-        <w:t xml:space="preserve">November 4 (3Q26): earnings should beat ($0.90 guided against $0.83), but those cruises were sold before the cuts; the number to watch is September 30 advance ticket sales, which we expect at $2.94B (−7% y/y). Late February: the first 2027 guide, which we expect at or below flat net yield against +1.6% in the consensus case. May 2027: 1Q27 results, where we model occupancy of 101.8% and ticket price per passenger day down 2.8%. We would cover on the data, whatever the price: advance ticket sales of $3.11B or more, a fare-panel re-run showing NCL’s 1H27 Caribbean cuts back near peers’, or a 2027 guide above +1%.</w:t>
+        <w:t xml:space="preserve">November 4 (3Q26): earnings should beat ($0.90 guided against $0.83), but those cruises were sold before the cuts; the number to watch is September 30 advance ticket sales, which we expect at $2.94B (−7% y/y). Late February: the first 2027 guide, which we expect at or below flat net yield against +1.6% in the consensus case. May 2027: 1Q27 results (we model occupancy of 101.8%, ticket price −2.8%). We would cover on the data, whatever the price: advance ticket sales of $3.11B or more, a fare-panel re-run showing NCL’s 1H27 Caribbean cuts back near peers’, or a 2027 guide above +1%.</w:t>
       </w:r>
     </w:p>
     <w:p>
@@ -1711,7 +1711,7 @@
         <w:t xml:space="preserve">Risks and sizing: </w:t>
       </w:r>
       <w:r>
-        <w:t xml:space="preserve">The main risk is a squeeze. 95M shares are short (5.7 days to cover), and the stock rose 48% in six weeks this spring when oil fell. About half of NCLH’s moves follow oil and its peers, so we would start with a third of the position, add on oil- or ceasefire-driven rallies and around November 4 and February, hold part of it in puts, and stop out above $19, where shorts added at about $18 are under water and the bull case begins. Elliott could push for a sale, though net debt above 5x EBITDA makes a buyout hard to finance. We could also be early: in this cycle deposits turned about a year before net yield.</w:t>
+        <w:t xml:space="preserve">The main risk is a squeeze. 95M shares are short (5.7 days to cover), and the stock rose 48% in six weeks this spring when oil fell. About half of NCLH’s moves follow oil and its peers, so we would start with a third of the position, add on oil- or ceasefire-driven rallies and around November 4 and February, hold part of it in puts, and stop out above $19, where shorts added at about $18 are under water and the bull case begins. Elliott could push for a sale, though net debt above 5x EBITDA makes a buyout hard to finance. We could also be early on timing.</w:t>
       </w:r>
     </w:p>
     <w:p>
@@ -1724,7 +1724,7 @@
           <w:color w:val="404040"/>
           <w:sz w:val="13"/>
         </w:rPr>
-        <w:t xml:space="preserve">Sources: NCLH 8-Ks (Nov 4, 2025–Sep 30, 2026), 10-Ks FY24–25, 2Q26 10-Q and call; ncl.com Best Price Guarantee terms; allaboarddeals.com fares (collected Oct 2, 2026) and policy summary (Apr 2026); Carnival 8-K (Sep 29, 2026); Royal Caribbean 2Q26 10-Q; SEC XBRL; Nasdaq/Zacks and Yahoo consensus (Oct 2, 2026); Wells Fargo action via news reports (Sep 2026); FINRA short interest; FRED; Kenneth French Data Library. Estimates are the team’s (NCLH_model_v6.xlsx). AI disclosure: [team to complete under Rule 10].</w:t>
+        <w:t xml:space="preserve">Sources: NCLH 8-Ks (Nov 4, 2025–Sep 30, 2026), 10-Ks FY24–25, 2Q26 10-Q and call; ncl.com Best Price Guarantee terms; allaboarddeals.com fares (collected Oct 2, 2026) and policy summary (Apr 2026); Carnival 8-K (Sep 29, 2026); Royal Caribbean 2Q26 10-Q; SEC XBRL; Nasdaq/Zacks and Yahoo consensus (Oct 2, 2026); FINRA short interest; FRED; Kenneth French Data Library. Estimates are the team’s (NCLH_model_v6.xlsx). AI disclosure: [team to complete under Rule 10].</w:t>
       </w:r>
     </w:p>
     <w:sectPr>

</xml_diff>

<commit_message>
Drop KPI labels from the memo, add strengths/weaknesses and a sell-side quote; remove Thesis to KPIs tab
Co-Authored-By: Claude Opus 5.5 <noreply@anthropic.com>
Claude-Session: https://claude.ai/code/session_01XEymX7iPffNP52qHnJAtAJ
</commit_message>
<xml_diff>
--- a/NCLH_memo_v13.docx
+++ b/NCLH_memo_v13.docx
@@ -15,7 +15,7 @@
         <w:t xml:space="preserve">Narrative Summary: </w:t>
       </w:r>
       <w:r>
-        <w:t xml:space="preserve">Recommendation: short NCLH at $15.05, starting at a third of a full position. Our base case is worth about $10.80 (−28%) and the probability-weighted value about $11.90 (−21%). The market prices NCLH on net yield (ticket and onboard revenue, less commissions and onboard costs, per available berth-day), and the share price assumes net yield climbs back above its 2025 level. We think it falls again in 2027, for two reasons. First, NCL is losing the Caribbean to Royal Caribbean and Carnival, whose private islands and ships fill at full price, so NCL has to fill its ships by cutting fares; this is competition, not the war, and its own new island and ships have not fixed it. Our scrape of 4,783 itineraries from a public fare tracker shows NCL’s 1H27 Caribbean fares down 14.5% while its rivals hold theirs, which lowers ticket price per passenger day (KPI 1). Second, NCL’s Best Price Guarantee gives guests no reason to book early, so management’s plan to rebuild prices by selling cabins early will not work. NCL’s deposits, from its SEC filings, already show the booking shortfall, and since COVID deposits have reached net yield about four quarters later; that lowers 2027 occupancy (KPI 2) and keeps 2H27 prices down. Our 2027 EBITDA of $2.47B is $221M below the Street’s $2.69B, and these two reasons account for almost all of the gap. Our EPS is $0.95; consensus of $1.46–1.67 is further off because it has not absorbed the September interest guide.</w:t>
+        <w:t xml:space="preserve">Recommendation: short NCLH at $15.05, starting at a third of a full position. Our base case is worth about $10.80 (−28%) and the probability-weighted value about $11.90 (−21%). The market prices NCLH on net yield (ticket and onboard revenue, less commissions and onboard costs, per available berth-day), and the share price assumes net yield climbs back above its 2025 level. We think it falls again in 2027, for two reasons. First, NCL is losing the Caribbean to Royal Caribbean and Carnival, whose private islands and ships fill at full price, so NCL has to fill its ships by cutting fares; this is competition, not the war, and its own new island and ships have not fixed it. Our scrape of 4,783 itineraries from a public fare tracker shows NCL’s 1H27 Caribbean fares down 14.5% while its rivals hold theirs, which lowers ticket price per passenger day. Second, NCL’s Best Price Guarantee gives guests no reason to book early, so management’s plan to rebuild prices by selling cabins early will not work. NCL’s deposits, from its SEC filings, already show the booking shortfall, and since COVID deposits have reached net yield about four quarters later; that lowers 2027 occupancy and keeps 2H27 prices down. Our 2027 EBITDA of $2.47B is $221M below the Street’s $2.69B, and these two reasons account for almost all of the gap. Our EPS is $0.95; consensus of $1.46–1.67 is further off because it has not absorbed the September interest guide.</w:t>
       </w:r>
     </w:p>
     <w:p>
@@ -47,7 +47,7 @@
         <w:t xml:space="preserve">Industry Overview: </w:t>
       </w:r>
       <w:r>
-        <w:t xml:space="preserve">Carnival (about 32% of capacity), Royal Caribbean (26%), MSC and NCLH (about 10% each) carry about 80% of the market. Demand is healthy overall: Carnival’s deposits are up 6.5% on flat capacity and Royal’s are up 5.6%. The competition is in the Caribbean, where each large line now sells a private island, and NCL arrived with the most new capacity and the last island to be finished (September 2026). 2025 return on capital was about 16% at Royal and 12% at Carnival, against 10% at NCLH.</w:t>
+        <w:t xml:space="preserve">Carnival (about 32% of capacity), Royal Caribbean (26%), MSC and NCLH (about 10% each) carry about 80% of the market. Demand is healthy overall: Carnival’s deposits are up 6.5% on flat capacity and Royal’s are up 5.6%. The competition is in the Caribbean, where each large line now sells a private island, and NCL arrived with the most new capacity and the last island to be finished (September 2026). NCLH’s strengths are luxury brands that are not cutting price and one of the youngest fleets; its weaknesses are the most debt of the three (5.4x EBITDA), the weakest Caribbean product and a new CEO after two guidance cuts. 2025 return on capital was about 10%, against 16% at Royal and 12% at Carnival.</w:t>
       </w:r>
     </w:p>
     <w:p>
@@ -112,7 +112,7 @@
         <w:t xml:space="preserve">Market Expectations: </w:t>
       </w:r>
       <w:r>
-        <w:t xml:space="preserve">Since 2024 NCLH’s EV/EBITDA has tracked net yield growth closely (r = 0.87 over ten quarters), and on the four days management changed its yield outlook the stock lost 27 points against Royal and Carnival. Working back from the $21.7B enterprise value at a 9% WACC, the price needs about $3.0B of steady-state EBITDA, which is management’s March guide and net yield back above its 2025 level (Exhibit 1). The Street is less demanding but still expects a recovery: it models 2027 revenue of $10.6B and EBITDA of $2.69B, and the $18.80 average target needs $2.9B. Since net yield is occupancy times revenue per passenger day, the debate comes down to two KPIs: ticket price per passenger day (KPI 1), which the consensus case has stabilizing, and occupancy (KPI 2), which it has recovering by a point in 2027. Each thesis goes against one of them.</w:t>
+        <w:t xml:space="preserve">Since 2024 NCLH’s EV/EBITDA has tracked net yield growth closely (r = 0.87 over ten quarters), and on the four days management changed its yield outlook the stock lost 27 points against Royal and Carnival. Working back from the $21.7B enterprise value at a 9% WACC, the price needs about $3.0B of steady-state EBITDA, which is management’s March guide and net yield back above its 2025 level (Exhibit 1). The Street is less demanding but still expects a recovery: it models 2027 revenue of $10.6B and EBITDA of $2.69B, and the $18.80 average target needs $2.9B. Since net yield is occupancy times revenue per passenger day, the debate comes down to two drivers: ticket price per passenger day, which the consensus case has stabilizing, and occupancy, which it has recovering by a point in 2027. Each thesis goes against one of them.</w:t>
       </w:r>
     </w:p>
     <w:p>
@@ -184,7 +184,7 @@
         <w:rPr>
           <w:b/>
         </w:rPr>
-        <w:t xml:space="preserve">Thesis 1: NCL is cutting prices because it is losing share in the Caribbean, which keeps ticket price per passenger day (KPI 1) falling. </w:t>
+        <w:t xml:space="preserve">Thesis 1: NCL is cutting prices because it is losing share in the Caribbean, which keeps ticket price per passenger day falling. </w:t>
       </w:r>
       <w:r>
         <w:t xml:space="preserve">The Street reads the discounting as a result of the war and of execution problems that the finished island and new ships will fix in 2027. We think the cause is competition. Every large line added Caribbean ships and a private island at the same time, and because a ship costs about the same to sail full or empty, the line with the weakest product fills its ships by cutting price. The fare data fits that. On October 2 we compared the lowest fare on 4,783 itineraries with each one’s 90-day average. NCL has cut 1H27 Caribbean sailings by a median 14.5% but Europe by only 2%, although two-thirds of its European guests fly in and face higher airfares. Royal and Carnival, which also added Caribbean ships, have held Caribbean prices and are discounting Europe instead (Exhibit 2). If the war were the cause, we would expect the opposite pattern. The cuts are also recent. NCL cut prices less often than Royal in 2025, but it went from 1 to 9 of the industry’s 10 largest monthly price cuts between December and October. The new product has not stopped them: sailings that call at NCL’s island are cut as much as its other Caribbean sailings, and its newest ships are cut 22% against 1% for Royal’s newest. NCL now prices below the budget brand: from Port Canaveral in 1H27 its lowest fare is $94 a night against $100 at Carnival. Oceania and Regent show no cuts, so the problem is the NCL brand.</w:t>
@@ -197,7 +197,7 @@
         <w:jc w:val="both"/>
       </w:pPr>
       <w:r>
-        <w:t xml:space="preserve">From Thesis 1 to KPI 1: lowest fares are not realized prices, but realized prices are moving the same way (NCLH’s ticket revenue per passenger day fell 5.6% in 1H26), and the cuts matter only for cabins NCL has not yet sold. With a normal booking curve and the booking shortfall from Thesis 2, about 45% of 1Q27 and 55% of 2Q27 cabins are still unsold, and 74% of NCL-brand capacity sails in the Caribbean in 1Q27. We weight the NCL brand at 65% of ticket revenue: if Oceania and Regent sell near their lowest fares, as all-suite ships tend to, NCL must make up about 66% of the $265 of ticket revenue per passenger day NCLH reported for 2025. That takes 1H27 ticket price (KPI 1) to −2.6% y/y against −1.1% in the consensus case. The same data, with Q4 sailings cut 36%, puts 4Q26 net yield at −7.0%, half a point below the implied guide. The main risk is that the cuts reverse before guests book; we re-run the fare panel monthly.</w:t>
+        <w:t xml:space="preserve">In the model: lowest fares are not realized prices, but realized prices are moving the same way (NCLH’s ticket revenue per passenger day fell 5.6% in 1H26), and the cuts matter only for cabins NCL has not yet sold. With a normal booking curve and the booking shortfall from Thesis 2, about 45% of 1Q27 and 55% of 2Q27 cabins are still unsold, and 74% of NCL-brand capacity sails in the Caribbean in 1Q27. We weight the NCL brand at 65% of ticket revenue: if Oceania and Regent sell near their lowest fares, as all-suite ships tend to, NCL must make up about 66% of the $265 of ticket revenue per passenger day NCLH reported for 2025. That takes 1H27 ticket price to −2.6% y/y against −1.1% in the consensus case. The same data, with Q4 sailings cut 36%, puts 4Q26 net yield at −7.0%, half a point below the implied guide. The main risk is that the cuts reverse before guests book; we re-run the fare panel monthly.</w:t>
       </w:r>
     </w:p>
     <w:p>
@@ -210,10 +210,10 @@
         <w:rPr>
           <w:b/>
         </w:rPr>
-        <w:t xml:space="preserve">Thesis 2: NCL’s booking shortfall is already in its deposits and reaches net yield about a year later, which holds down occupancy (KPI 2). </w:t>
+        <w:t xml:space="preserve">Thesis 2: NCL’s booking shortfall is already in its deposits and reaches net yield about a year later, which holds down occupancy. </w:t>
       </w:r>
       <w:r>
-        <w:t xml:space="preserve">The consensus case has net yield up about 3% in 2H27, helped by easy comparisons and by base-loading: opening sailings at lower fares and raising them as ships fill. That needs guests who book early because they expect prices to rise. NCL’s Best Price Guarantee removes the reason to: before final payment a booked guest can move to any lower fare, and after it a guest on a cruise of six nights or more gets an upgrade or future-cruise credit for the difference, while Royal offers nothing after final payment. NCL has also shown guests that it cuts late: 77% of its 4Q26 Caribbean sailings of seven nights or more have been cut 20% or more. Filling ships late with price has costs beyond the fare: in 1Q26 occupancy rose 2.3 points, but net yield still fell 1.0% and onboard revenue per passenger day fell 2.9%, because guests who buy on discount spend less on board.</w:t>
+        <w:t xml:space="preserve">The consensus case has net yield up about 3% in 2H27, helped by easy comparisons and by base-loading, which Zacks expects to “maximize yield across the full booking cycle while maintaining pricing integrity”: opening sailings at lower fares and raising them as ships fill. That needs guests who book early because they expect prices to rise. NCL’s Best Price Guarantee removes the reason to: before final payment a booked guest can move to any lower fare, and after it a guest on a cruise of six nights or more gets an upgrade or future-cruise credit for the difference, while Royal offers nothing after final payment. NCL has also shown guests that it cuts late: 77% of its 4Q26 Caribbean sailings of seven nights or more have been cut 20% or more. Filling ships late with price has costs beyond the fare: in 1Q26 occupancy rose 2.3 points, but net yield still fell 1.0% and onboard revenue per passenger day fell 2.9%, because guests who buy on discount spend less on board.</w:t>
       </w:r>
     </w:p>
     <w:p>
@@ -282,7 +282,7 @@
         <w:jc w:val="both"/>
       </w:pPr>
       <w:r>
-        <w:t xml:space="preserve">From Thesis 2 to KPI 2: we size the shortfall from deposits: if booked fares fell as much as realized fares, about 3 points fewer cabins are booked; if booked fares were flat, about 8. We use 5. We assume 20% of those cabins sail empty, about half of what the 2026 link between deposits and occupancy implies, and the rest sell late at NCL’s current close-in discount of about 25%. That puts 2027 occupancy (KPI 2) at 102.1%, a point below the consensus case, takes about 0.9 points off 2H27 ticket price and holds onboard spending growth to 2% against 3.5% (it fell 0.3% in 2025 and rose about 1% in 1H26).</w:t>
+        <w:t xml:space="preserve">In the model, we size the shortfall from deposits: if booked fares fell as much as realized fares, about 3 points fewer cabins are booked; if booked fares were flat, about 8. We use 5. We assume 20% of those cabins sail empty, about half of what the 2026 link between deposits and occupancy implies, and the rest sell late at NCL’s current close-in discount of about 25%. That puts 2027 occupancy at 102.1%, a point below the consensus case, takes about 0.9 points off 2H27 ticket price and holds onboard spending growth to 2% against 3.5% (it fell 0.3% in 2025 and rose about 1% in 1H26).</w:t>
       </w:r>
     </w:p>
     <w:p>
@@ -338,7 +338,7 @@
               <w:t xml:space="preserve">From the data to the model: </w:t>
             </w:r>
             <w:r>
-              <w:t xml:space="preserve">Each thesis moves one KPI in our quarterly net yield build (net yield = occupancy × revenue per passenger day): the fare panel sets the price cut on unsold cabins (KPI 1), and deposits set the booking shortfall, which shows up as empty cabins (KPI 2) and late discounts. Our consensus case reproduces the Street’s 2027 revenue ($10.6B) and, at run-rate unit costs, its EBITDA ($2.68B against $2.69B). We use the same costs, so the whole $208M gap to our $2.47B comes from the two theses (Exhibit 4). Consensus EPS needs more: unit costs falling 0.5% in 2027, worth another $107M.</w:t>
+              <w:t xml:space="preserve">Each thesis moves one driver of our quarterly net yield build (net yield = occupancy × revenue per passenger day): the fare panel sets the price cut on unsold cabins, and deposits set the booking shortfall, which shows up as empty cabins and late discounts. Our consensus case reproduces the Street’s 2027 revenue ($10.6B) and, at run-rate unit costs, its EBITDA ($2.68B against $2.69B). We use the same costs, so the whole $208M gap to our $2.47B comes from the two theses (Exhibit 4). Consensus EPS needs more: unit costs falling 0.5% in 2027, worth another $107M.</w:t>
             </w:r>
           </w:p>
           <w:tbl>
@@ -543,7 +543,7 @@
                     <w:rPr>
                       <w:sz w:val="15"/>
                     </w:rPr>
-                    <w:t xml:space="preserve">Fare panel → KPI 1: 1H27 ticket price y/y</w:t>
+                    <w:t xml:space="preserve">Fare panel → 1H27 ticket price y/y</w:t>
                   </w:r>
                 </w:p>
               </w:tc>
@@ -619,7 +619,7 @@
                     <w:rPr>
                       <w:sz w:val="15"/>
                     </w:rPr>
-                    <w:t xml:space="preserve">Deposits → KPI 1: 2H27 ticket price y/y</w:t>
+                    <w:t xml:space="preserve">Deposits → 2H27 ticket price y/y</w:t>
                   </w:r>
                 </w:p>
               </w:tc>
@@ -695,7 +695,7 @@
                     <w:rPr>
                       <w:sz w:val="15"/>
                     </w:rPr>
-                    <w:t xml:space="preserve">Deposits → KPI 2: 2027 occupancy</w:t>
+                    <w:t xml:space="preserve">Deposits → 2027 occupancy</w:t>
                   </w:r>
                 </w:p>
               </w:tc>
@@ -1724,7 +1724,7 @@
           <w:color w:val="404040"/>
           <w:sz w:val="13"/>
         </w:rPr>
-        <w:t xml:space="preserve">Sources: NCLH 8-Ks (Nov 4, 2025–Sep 30, 2026), 10-Ks FY24–25, 2Q26 10-Q and call; ncl.com Best Price Guarantee terms; allaboarddeals.com fares (collected Oct 2, 2026) and policy summary (Apr 2026); Carnival 8-K (Sep 29, 2026); Royal Caribbean 2Q26 10-Q; SEC XBRL; Nasdaq/Zacks and Yahoo consensus (Oct 2, 2026); FINRA short interest; FRED; Kenneth French Data Library. Estimates are the team’s (NCLH_model_v6.xlsx). AI disclosure: [team to complete under Rule 10].</w:t>
+        <w:t xml:space="preserve">Sources: NCLH 8-Ks (Nov 4, 2025–Sep 30, 2026), 10-Ks FY24–25, 2Q26 10-Q and call; ncl.com Best Price Guarantee terms; allaboarddeals.com fares (collected Oct 2, 2026) and policy summary (Apr 2026); Carnival 8-K (Sep 29, 2026); Royal Caribbean 2Q26 10-Q; SEC XBRL; Nasdaq/Zacks and Yahoo consensus (Oct 2, 2026); Wells Fargo note via news reports (Sep 2026); FINRA short interest; FRED; Kenneth French Data Library. Estimates are the team’s (NCLH_model_v6.xlsx). AI disclosure: [team to complete under Rule 10].</w:t>
       </w:r>
     </w:p>
     <w:sectPr>

</xml_diff>

<commit_message>
Rewrite memo in plain parallel prose, expand model and valuation section, drop arrows
Co-Authored-By: Claude Opus 5.5 <noreply@anthropic.com>
Claude-Session: https://claude.ai/code/session_01XEymX7iPffNP52qHnJAtAJ
</commit_message>
<xml_diff>
--- a/NCLH_memo_v13.docx
+++ b/NCLH_memo_v13.docx
@@ -15,7 +15,7 @@
         <w:t xml:space="preserve">Narrative Summary: </w:t>
       </w:r>
       <w:r>
-        <w:t xml:space="preserve">Recommendation: short NCLH at $15.05, starting at a third of a full position. Our base case is worth about $10.80 (−28%) and the probability-weighted value about $11.90 (−21%). The market prices NCLH on net yield (ticket and onboard revenue, less commissions and onboard costs, per available berth-day), and the share price assumes net yield climbs back above its 2025 level. We think it falls again in 2027, for two reasons. First, NCL is losing the Caribbean to Royal Caribbean and Carnival, whose private islands and ships fill at full price, so NCL has to fill its ships by cutting fares; this is competition, not the war, and its own new island and ships have not fixed it. Our scrape of 4,783 itineraries from a public fare tracker shows NCL’s 1H27 Caribbean fares down 14.5% while its rivals hold theirs, which lowers ticket price per passenger day. Second, NCL’s Best Price Guarantee gives guests no reason to book early, so management’s plan to rebuild prices by selling cabins early will not work. NCL’s deposits, from its SEC filings, already show the booking shortfall, and since COVID deposits have reached net yield about four quarters later; that lowers 2027 occupancy and keeps 2H27 prices down. Our 2027 EBITDA of $2.47B is $221M below the Street’s $2.69B, and these two reasons account for almost all of the gap. Our EPS is $0.95; consensus of $1.46–1.67 is further off because it has not absorbed the September interest guide.</w:t>
+        <w:t xml:space="preserve">Recommendation: short NCLH at $15.05, starting with a third of a full position. Our base-case value is $10.80 a share (−28%), and our probability-weighted value is $11.90 (−21%). The market values NCLH on net yield, the revenue it keeps per available berth-day after commissions and onboard costs, and the share price assumes net yield returns above its 2025 level. We expect it to fall again in 2027, for two reasons. First, NCL is losing the Caribbean to Royal Caribbean and Carnival. Their private islands and ships sell at full price, so NCL fills its ships by cutting fares, and its own new island and ships have not changed that. Our scrape of 4,783 itineraries from a public fare tracker shows NCL’s 1H27 Caribbean fares down 14.5% while its rivals’ are flat. Second, NCL’s Best Price Guarantee gives guests no reason to book early, so management’s plan to rebuild prices through early bookings will not work. NCL’s deposits, taken from its SEC filings, already show the booking shortfall, and since COVID deposits have led net yield by about four quarters. Together the two theses lower ticket prices, occupancy and onboard spending in 2027, and they explain almost all of the $221M gap between our 2027 EBITDA of $2.47B and the Street’s $2.69B. Our 2027 EPS is $0.95, against consensus of $1.46–1.67 that has not yet absorbed the September interest guide.</w:t>
       </w:r>
     </w:p>
     <w:p>
@@ -31,7 +31,7 @@
         <w:t xml:space="preserve">Company Overview: </w:t>
       </w:r>
       <w:r>
-        <w:t xml:space="preserve">NCLH runs 35 ships with about 75,000 berths: Norwegian Cruise Line (NCL), the mass-market brand with about 83% of berths, plus the upper-premium Oceania and luxury Regent brands. In 2025 it earned $9.8B of revenue, $2.73B of adjusted EBITDA and $2.11 of EPS, and it carries $14.8B of net debt, two-thirds of enterprise value. The debt is why small changes in net yield move the equity: each 1% is about $75M of EBITDA and 9% of the share price. Then 2026 went badly. NCL added about 40% more Caribbean capacity before its Great Stirrup Cay upgrade was ready, the Iran war pushed oil above $100, and guidance fell from flat net yield and $2.38 of EPS in March to about −5% and $1.50 in July. In February John Chidsey replaced Harry Sommer as CEO, under a cooperation agreement with Elliott, a holder of more than 10%.</w:t>
+        <w:t xml:space="preserve">NCLH operates 35 ships with about 75,000 berths. Norwegian Cruise Line (NCL), its mass-market brand, has about 83% of the berths; Oceania (upper premium) and Regent (luxury) have the rest. In 2025 NCLH earned $9.8B of revenue, $2.73B of adjusted EBITDA and $2.11 of EPS. Net debt is $14.8B, two-thirds of enterprise value, so small changes in net yield move the equity a lot: each 1% is worth about $75M of EBITDA and 9% of the share price. 2026 has gone badly. NCL added about 40% more Caribbean capacity before its Great Stirrup Cay upgrade was ready, the Iran war pushed oil above $100, and guidance fell from flat net yield and $2.38 of EPS in March to about −5% and $1.50 in July. In February John Chidsey replaced Harry Sommer as CEO under a cooperation agreement with Elliott, which owns more than 10%.</w:t>
       </w:r>
     </w:p>
     <w:p>
@@ -47,7 +47,7 @@
         <w:t xml:space="preserve">Industry Overview: </w:t>
       </w:r>
       <w:r>
-        <w:t xml:space="preserve">Carnival (about 32% of capacity), Royal Caribbean (26%), MSC and NCLH (about 10% each) carry about 80% of the market. Demand is healthy overall: Carnival’s deposits are up 6.5% on flat capacity and Royal’s are up 5.6%. The competition is in the Caribbean, where each large line now sells a private island, and NCL arrived with the most new capacity and the last island to be finished (September 2026). NCLH’s strengths are luxury brands that are not cutting price and one of the youngest fleets; its weaknesses are the most debt of the three (5.4x EBITDA), the weakest Caribbean product and a new CEO after two guidance cuts. 2025 return on capital was about 10%, against 16% at Royal and 12% at Carnival.</w:t>
+        <w:t xml:space="preserve">Carnival (about 32% of capacity), Royal Caribbean (26%), MSC (10%) and NCLH (10%) carry about 80% of the market. Demand is healthy: Carnival’s deposits are up 6.5% on flat capacity and Royal’s are up 5.6%. The competition is in the Caribbean, where each large line now sells its own private island; NCL added the most new capacity there and finished its island last (September 2026). NCLH’s strengths are luxury brands that are not cutting price and one of the youngest fleets. Its weaknesses are the highest leverage of the three (5.4x EBITDA), the weakest Caribbean product and a new CEO after two guidance cuts.</w:t>
       </w:r>
     </w:p>
     <w:p>
@@ -112,7 +112,7 @@
         <w:t xml:space="preserve">Market Expectations: </w:t>
       </w:r>
       <w:r>
-        <w:t xml:space="preserve">Since 2024 NCLH’s EV/EBITDA has tracked net yield growth closely (r = 0.87 over ten quarters), and on the four days management changed its yield outlook the stock lost 27 points against Royal and Carnival. Working back from the $21.7B enterprise value at a 9% WACC, the price needs about $3.0B of steady-state EBITDA, which is management’s March guide and net yield back above its 2025 level (Exhibit 1). The Street is less demanding but still expects a recovery: it models 2027 revenue of $10.6B and EBITDA of $2.69B, and the $18.80 average target needs $2.9B. Since net yield is occupancy times revenue per passenger day, the debate comes down to two drivers: ticket price per passenger day, which the consensus case has stabilizing, and occupancy, which it has recovering by a point in 2027. Each thesis goes against one of them.</w:t>
+        <w:t xml:space="preserve">Since 2024 NCLH’s EV/EBITDA has moved with net yield growth (r = 0.87 over ten quarters), and on the four days management changed its yield outlook the stock lost 27 points against Royal and Carnival. Working back from the $21.7B enterprise value at a 9% WACC, the price needs about $3.0B of steady-state EBITDA. That is management’s March guide, and it requires net yield above its 2025 level (Exhibit 1). The Street expects less but still expects a recovery: 2027 revenue of $10.6B, EBITDA of $2.69B and an $18.80 average target that needs $2.9B. Because net yield is occupancy times revenue per passenger day, the debate comes down to two drivers. The consensus case has ticket prices stabilizing and occupancy recovering by a point in 2027, and each of our theses goes against one of them.</w:t>
       </w:r>
     </w:p>
     <w:p>
@@ -122,7 +122,7 @@
         <w:jc w:val="both"/>
       </w:pPr>
       <w:r>
-        <w:t xml:space="preserve">Sentiment has turned faster than estimates. Ratings are 4 Buy, 15 Hold, 0 Sell and short interest is 20.7% of float, yet consensus 2027 EPS moved only two cents when NCLH guided 2027 interest $0.35 a share higher on September 30; at the Street’s own EBITDA and the guided interest, EPS is about $1.41. The bull argument is that the selloff was oil and the sector. Our regression puts 54% of the decline there, but NCLH moved no more than Carnival on the biggest oil days, and the NCL-specific 46% came on six company news days and did not reverse.</w:t>
+        <w:t xml:space="preserve">Estimates have not kept up with sentiment. Ratings are 4 Buy, 15 Hold and 0 Sell, and short interest is 20.7% of float, yet consensus 2027 EPS fell only two cents after NCLH guided 2027 interest $0.35 a share higher on September 30. At the Street’s own EBITDA and the guided interest, EPS would be about $1.41. Bulls argue that the selloff was about oil and the sector. Our regression attributes 54% of the decline to the market, oil and peers, but NCLH moved no more than Carnival on the biggest oil days, and the NCL-specific 46% came on six company news days and did not reverse.</w:t>
       </w:r>
     </w:p>
     <w:p>
@@ -184,10 +184,10 @@
         <w:rPr>
           <w:b/>
         </w:rPr>
-        <w:t xml:space="preserve">Thesis 1: NCL is cutting prices because it is losing share in the Caribbean, which keeps ticket price per passenger day falling. </w:t>
+        <w:t xml:space="preserve">Thesis 1: NCL is cutting prices because it is losing share in the Caribbean, and those cuts will reach 2027 revenue. </w:t>
       </w:r>
       <w:r>
-        <w:t xml:space="preserve">The Street reads the discounting as a result of the war and of execution problems that the finished island and new ships will fix in 2027. We think the cause is competition. Every large line added Caribbean ships and a private island at the same time, and because a ship costs about the same to sail full or empty, the line with the weakest product fills its ships by cutting price. The fare data fits that. On October 2 we compared the lowest fare on 4,783 itineraries with each one’s 90-day average. NCL has cut 1H27 Caribbean sailings by a median 14.5% but Europe by only 2%, although two-thirds of its European guests fly in and face higher airfares. Royal and Carnival, which also added Caribbean ships, have held Caribbean prices and are discounting Europe instead (Exhibit 2). If the war were the cause, we would expect the opposite pattern. The cuts are also recent. NCL cut prices less often than Royal in 2025, but it went from 1 to 9 of the industry’s 10 largest monthly price cuts between December and October. The new product has not stopped them: sailings that call at NCL’s island are cut as much as its other Caribbean sailings, and its newest ships are cut 22% against 1% for Royal’s newest. NCL now prices below the budget brand: from Port Canaveral in 1H27 its lowest fare is $94 a night against $100 at Carnival. Oceania and Regent show no cuts, so the problem is the NCL brand.</w:t>
+        <w:t xml:space="preserve">The Street sees the discounting as a result of the war and of execution problems that the finished island and new ships will fix in 2027. We think the cause is competition. Every large line added Caribbean ships and a private island at the same time, and because a ship costs about the same to sail full or empty, the line with the weakest product fills its ships by cutting price. The fare data supports this. On October 2 we compared the lowest fare on 4,783 itineraries with each itinerary’s own 90-day average. NCL has cut 1H27 Caribbean sailings by a median 14.5% and Europe by only 2%, even though two-thirds of its European guests fly in and face higher airfares. Royal and Carnival also added Caribbean ships, yet they have held Caribbean prices and are discounting Europe instead (Exhibit 2). If the war were the cause, the pattern would be the reverse. The cuts are also recent: NCL cut prices less often than Royal in 2025, but between December and October it went from 1 to 9 of the industry’s 10 largest monthly price cuts. The new product has not stopped them. Sailings that call at NCL’s island are cut as much as its other Caribbean sailings, and its newest ships are cut 22%, against 1% for Royal’s newest. Oceania and Regent show no cuts, so the problem is the NCL brand.</w:t>
       </w:r>
     </w:p>
     <w:p>
@@ -197,7 +197,7 @@
         <w:jc w:val="both"/>
       </w:pPr>
       <w:r>
-        <w:t xml:space="preserve">In the model: lowest fares are not realized prices, but realized prices are moving the same way (NCLH’s ticket revenue per passenger day fell 5.6% in 1H26), and the cuts matter only for cabins NCL has not yet sold. With a normal booking curve and the booking shortfall from Thesis 2, about 45% of 1Q27 and 55% of 2Q27 cabins are still unsold, and 74% of NCL-brand capacity sails in the Caribbean in 1Q27. We weight the NCL brand at 65% of ticket revenue: if Oceania and Regent sell near their lowest fares, as all-suite ships tend to, NCL must make up about 66% of the $265 of ticket revenue per passenger day NCLH reported for 2025. That takes 1H27 ticket price to −2.6% y/y against −1.1% in the consensus case. The same data, with Q4 sailings cut 36%, puts 4Q26 net yield at −7.0%, half a point below the implied guide. The main risk is that the cuts reverse before guests book; we re-run the fare panel monthly.</w:t>
+        <w:t xml:space="preserve">We apply the cuts only to cabins NCL has not yet sold. Lowest fares are not realized prices, but realized prices are moving the same way: ticket revenue per passenger day fell 5.6% in 1H26. Using a standard booking curve plus the shortfall from Thesis 2, about 45% of 1Q27 and 55% of 2Q27 cabins are still unsold. We weight the NCL brand at 65% of ticket revenue, which matches NCLH’s reported $265 of ticket revenue per passenger day if Oceania and Regent sell near their lowest fares. The result is 1H27 ticket revenue per passenger day down 2.6% y/y, against 1.1% in the consensus case, and 4Q26 net yield of −7.0%, half a point below the implied guide. The main risk is that the cuts reverse before guests book, so we re-run the fare panel every month.</w:t>
       </w:r>
     </w:p>
     <w:p>
@@ -210,10 +210,10 @@
         <w:rPr>
           <w:b/>
         </w:rPr>
-        <w:t xml:space="preserve">Thesis 2: NCL’s booking shortfall is already in its deposits and reaches net yield about a year later, which holds down occupancy. </w:t>
+        <w:t xml:space="preserve">Thesis 2: NCL’s booking shortfall is already in its deposits, and deposits lead net yield by about a year. </w:t>
       </w:r>
       <w:r>
-        <w:t xml:space="preserve">The consensus case has net yield up about 3% in 2H27, helped by easy comparisons and by base-loading, which Zacks expects to “maximize yield across the full booking cycle while maintaining pricing integrity”: opening sailings at lower fares and raising them as ships fill. That needs guests who book early because they expect prices to rise. NCL’s Best Price Guarantee removes the reason to: before final payment a booked guest can move to any lower fare, and after it a guest on a cruise of six nights or more gets an upgrade or future-cruise credit for the difference, while Royal offers nothing after final payment. NCL has also shown guests that it cuts late: 77% of its 4Q26 Caribbean sailings of seven nights or more have been cut 20% or more. Filling ships late with price has costs beyond the fare: in 1Q26 occupancy rose 2.3 points, but net yield still fell 1.0% and onboard revenue per passenger day fell 2.9%, because guests who buy on discount spend less on board.</w:t>
+        <w:t xml:space="preserve">The consensus case has net yield up about 3% in 2H27, helped by easy comparisons and by base-loading: opening sailings at lower fares and raising them as ships fill. Zacks expects this to “maximize yield across the full booking cycle while maintaining pricing integrity.” Base-loading needs guests who book early because they expect prices to rise, and NCL’s Best Price Guarantee removes that reason. Before final payment, a booked guest can move to any lower fare. After final payment, a guest on a cruise of six nights or more gets an upgrade or future-cruise credit for the difference; Royal offers nothing at that stage. NCL has also taught guests to wait: 77% of its 4Q26 Caribbean sailings of seven nights or more have been cut by 20% or more. Filling ships late is expensive. In 1Q26 NCL raised occupancy 2.3 points by cutting price, yet net yield fell 1.0% and onboard revenue per passenger day fell 2.9%, because guests who buy on discount spend less on board.</w:t>
       </w:r>
     </w:p>
     <w:p>
@@ -272,7 +272,7 @@
         </w:drawing>
       </w:r>
       <w:r>
-        <w:t xml:space="preserve">The shortfall is already visible. Deposits per future berth-day are down 8.3% y/y, the seventh decline in a row, while Royal’s and Carnival’s are growing, and NCL says it is “below its optimal booked position for the next 12 months.” This is not a shift to shorter cruises, which book later: about a third of 4Q26 Caribbean itineraries are 3–5 nights at NCL, Royal and Carnival alike. The lag from deposits to net yield is also predictable. Guests pay deposits when they book, so deposits move first. Before COVID the lead was one to two quarters. Since COVID guests book further ahead (advance ticket sales are about a third of annual revenue, against a quarter in 2016–18), and the lead has stretched to about four quarters: deposits turned negative in December 2024 and net yield followed in 1Q26. At a four-quarter lead the indicator has called the direction of net yield in 5 of 6 reported quarters, and the 3Q26 guide and 4Q26 implied figure fit as well (Exhibit 3). On that lag, the March and June readings fall on 1Q27 and 2Q27, the quarters consensus expects to recover. A simple fit over those eight quarters points to 1H27 net yield of about −4%, against −2.6% in our model and −0.2% in the consensus case.</w:t>
+        <w:t xml:space="preserve">Deposits already show the shortfall. Deposits per future berth-day are down 8.3% y/y, the seventh decline in a row, while Royal’s and Carnival’s are growing, and NCL says it is “below its optimal booked position for the next 12 months.” The decline is not a shift to shorter cruises, which book later: 3–5 night sailings are about a third of 4Q26 Caribbean itineraries at NCL, Royal and Carnival alike. The lag to net yield is predictable. Before COVID they led net yield by one to two quarters. Since COVID guests book further ahead, with advance ticket sales at about a third of annual revenue against a quarter in 2016–18, and the lead has stretched to about four quarters. Deposits turned negative in December 2024, and net yield followed in 1Q26. At a four-quarter lead, the indicator has called the direction of net yield in 5 of 6 reported quarters, and it also fits the 3Q26 guide and the 4Q26 implied figure (Exhibit 3). The March and June readings therefore point to weak 1Q27 and 2Q27 results, the quarters consensus expects to recover. A simple fit over these eight quarters implies 1H27 net yield of about −4%, against −2.6% in our model and −0.2% in the consensus case.</w:t>
       </w:r>
     </w:p>
     <w:p>
@@ -282,7 +282,7 @@
         <w:jc w:val="both"/>
       </w:pPr>
       <w:r>
-        <w:t xml:space="preserve">In the model, we size the shortfall from deposits: if booked fares fell as much as realized fares, about 3 points fewer cabins are booked; if booked fares were flat, about 8. We use 5. We assume 20% of those cabins sail empty, about half of what the 2026 link between deposits and occupancy implies, and the rest sell late at NCL’s current close-in discount of about 25%. That puts 2027 occupancy at 102.1%, a point below the consensus case, takes about 0.9 points off 2H27 ticket price and holds onboard spending growth to 2% against 3.5% (it fell 0.3% in 2025 and rose about 1% in 1H26).</w:t>
+        <w:t xml:space="preserve">We size the shortfall at 5 points, the midpoint of what deposits imply (about 3 points if booked fares fell as much as realized fares, about 8 if they were flat). We assume 20% of those cabins sail empty, about half of what the 2026 link between deposits and occupancy implies, and that the rest sell late at NCL’s current close-in discount of about 25%. This puts 2027 occupancy at 102.1%, a point below the consensus case, takes 0.9 points off 2H27 ticket prices and holds onboard spending growth to 2%, against 3.5% in the consensus case (−0.3% in 2025, about +1% in 1H26).</w:t>
       </w:r>
     </w:p>
     <w:p>
@@ -335,10 +335,10 @@
               <w:rPr>
                 <w:b/>
               </w:rPr>
-              <w:t xml:space="preserve">From the data to the model: </w:t>
+              <w:t xml:space="preserve">Model and valuation: </w:t>
             </w:r>
             <w:r>
-              <w:t xml:space="preserve">Each thesis moves one driver of our quarterly net yield build (net yield = occupancy × revenue per passenger day): the fare panel sets the price cut on unsold cabins, and deposits set the booking shortfall, which shows up as empty cabins and late discounts. Our consensus case reproduces the Street’s 2027 revenue ($10.6B) and, at run-rate unit costs, its EBITDA ($2.68B against $2.69B). We use the same costs, so the whole $208M gap to our $2.47B comes from the two theses (Exhibit 4). Consensus EPS needs more: unit costs falling 0.5% in 2027, worth another $107M.</w:t>
+              <w:t xml:space="preserve">Our model builds net yield quarter by quarter, as occupancy times ticket and onboard revenue per passenger day, less commissions and onboard costs. Three alternative-data builds feed it. The fare panel (4,783 itineraries across nine lines, each measured against its own 90-day price history) sets the price cut on unsold cabins by brand and region. The deposit build (SEC filings for NCLH, Royal and Carnival, back-tested over 20 quarters) sets the booking shortfall. A ship-by-ship fleet build sets quarterly capacity from delivery and exit dates. Our consensus case runs the same model on the Street’s assumptions and reproduces its 2027 revenue ($10.6B) and, at run-rate unit costs, its EBITDA ($2.68B against $2.69B). Because we use the same costs, the $208M gap to our $2.47B comes entirely from the two theses (Exhibit 4).</w:t>
             </w:r>
           </w:p>
           <w:tbl>
@@ -385,7 +385,7 @@
                       <w:b/>
                       <w:sz w:val="15"/>
                     </w:rPr>
-                    <w:t xml:space="preserve">Alternative data → model input</w:t>
+                    <w:t xml:space="preserve">Driver (data source)</w:t>
                   </w:r>
                 </w:p>
               </w:tc>
@@ -445,7 +445,7 @@
                       <w:b/>
                       <w:sz w:val="15"/>
                     </w:rPr>
-                    <w:t xml:space="preserve">EBITDA ($M)</w:t>
+                    <w:t xml:space="preserve">2027 EBITDA ($M)</w:t>
                   </w:r>
                 </w:p>
               </w:tc>
@@ -467,7 +467,7 @@
                     <w:rPr>
                       <w:sz w:val="15"/>
                     </w:rPr>
-                    <w:t xml:space="preserve">Fare panel → 4Q26 net yield (exit rate)</w:t>
+                    <w:t xml:space="preserve">4Q26 net yield, exit rate (fare panel)</w:t>
                   </w:r>
                 </w:p>
               </w:tc>
@@ -543,7 +543,7 @@
                     <w:rPr>
                       <w:sz w:val="15"/>
                     </w:rPr>
-                    <w:t xml:space="preserve">Fare panel → 1H27 ticket price y/y</w:t>
+                    <w:t xml:space="preserve">1H27 ticket price y/y (fare panel)</w:t>
                   </w:r>
                 </w:p>
               </w:tc>
@@ -619,7 +619,7 @@
                     <w:rPr>
                       <w:sz w:val="15"/>
                     </w:rPr>
-                    <w:t xml:space="preserve">Deposits → 2H27 ticket price y/y</w:t>
+                    <w:t xml:space="preserve">2H27 ticket price y/y (deposits)</w:t>
                   </w:r>
                 </w:p>
               </w:tc>
@@ -695,7 +695,7 @@
                     <w:rPr>
                       <w:sz w:val="15"/>
                     </w:rPr>
-                    <w:t xml:space="preserve">Deposits → 2027 occupancy</w:t>
+                    <w:t xml:space="preserve">2027 occupancy (deposits)</w:t>
                   </w:r>
                 </w:p>
               </w:tc>
@@ -771,7 +771,7 @@
                     <w:rPr>
                       <w:sz w:val="15"/>
                     </w:rPr>
-                    <w:t xml:space="preserve">Both → onboard spend per guest y/y</w:t>
+                    <w:t xml:space="preserve">Onboard spend per guest y/y (both)</w:t>
                   </w:r>
                 </w:p>
               </w:tc>
@@ -849,7 +849,7 @@
                       <w:b/>
                       <w:sz w:val="15"/>
                     </w:rPr>
-                    <w:t xml:space="preserve">2027 EBITDA (run-rate unit costs in both)</w:t>
+                    <w:t xml:space="preserve">2027 EBITDA, same unit costs</w:t>
                   </w:r>
                 </w:p>
               </w:tc>
@@ -989,10 +989,10 @@
         <w:rPr>
           <w:b/>
         </w:rPr>
-        <w:t xml:space="preserve">Valuation and risk/reward: </w:t>
+        <w:t xml:space="preserve">Valuation: </w:t>
       </w:r>
       <w:r>
-        <w:t xml:space="preserve">We value NCLH on 2027 EBITDA at today’s 8.5x forward multiple, less $15.9B of year-end net debt. Our $2.47B gives $10.82 a share (−28%), and a DCF of 2027–30 cash flows gives $8.26. Each point of 2027 ticket price is worth about $0.90 a share and each point of occupancy about $1.40. If consensus EPS is right (Street revenue plus falling unit costs) and the stock re-rates to 9x, it is worth about $19.70 (+31%); if discounting spreads into 2H27, about $6.20 (−59%). Weighted 25/50/25, value is about $11.90 (−21%). The multiple is the main valuation risk: at 9.0x our EBITDA is worth about $13.70 (−9%). We use today’s because NCLH’s multiple has fallen with net yield (10.0x to 8.7x from September 2025 to March 2026). If cost savings let unit costs fall 0.5%, value rises to about $12.80 (−15%).</w:t>
+        <w:t xml:space="preserve">Below EBITDA, unit costs excluding fuel rise 1% (as in 2025), fuel costs $800 a ton, D&amp;A is $1.15B and interest is the $870M NCLH guided on September 30, which gives 2027 EPS of $0.95. We value the shares on 2027 EBITDA at today’s forward multiple of 8.5x: the market’s $22.8B enterprise value (market cap plus year-end net debt) divided by the Street’s $2.69B. Applying that multiple to our $2.47B and deducting $15.9B of year-end net debt gives $10.82 a share (−28%). A DCF supports this. Discounting 2027–30 unlevered free cash flow, which is negative in 2027 while $2.9B of newbuild payments continue, at a 9.05% WACC and adding an exit value at 8.5x 2030 EBITDA of $3.15B gives $8.26. The bull case assumes consensus EPS is right, which needs the Street’s revenue plus unit costs falling 0.5%, and a re-rating to 9x; the bear case extends the 1H27 discounting into 2H27.</w:t>
       </w:r>
     </w:p>
     <w:tbl>
@@ -1692,10 +1692,26 @@
         <w:rPr>
           <w:b/>
         </w:rPr>
+        <w:t xml:space="preserve">Return profile: </w:t>
+      </w:r>
+      <w:r>
+        <w:t xml:space="preserve">Weighted 25/50/25, value is $11.90 (−21%), with $19.70 (+31%) in the bull case and $6.20 (−59%) in the bear case. The largest valuation risk is the multiple: at 9.0x, our EBITDA is worth $13.70 (−9%). We keep today’s multiple because NCLH’s multiple has fallen with net yield, from 10.0x in September 2025 to 8.7x in March 2026. If cost savings let unit costs fall 0.5%, value rises to $12.80 (−15%).</w:t>
+      </w:r>
+    </w:p>
+    <w:p>
+      <w:pPr>
+        <w:widowControl/>
+        <w:spacing w:before="40" w:after="40"/>
+        <w:jc w:val="both"/>
+      </w:pPr>
+      <w:r>
+        <w:rPr>
+          <w:b/>
+        </w:rPr>
         <w:t xml:space="preserve">Catalysts and when we would cover: </w:t>
       </w:r>
       <w:r>
-        <w:t xml:space="preserve">November 4 (3Q26): earnings should beat ($0.90 guided against $0.83), but those cruises were sold before the cuts; the number to watch is September 30 advance ticket sales, which we expect at $2.94B (−7% y/y). Late February: the first 2027 guide, which we expect at or below flat net yield against +1.6% in the consensus case. May 2027: 1Q27 results (we model occupancy of 101.8%, ticket price −2.8%). We would cover on the data, whatever the price: advance ticket sales of $3.11B or more, a fare-panel re-run showing NCL’s 1H27 Caribbean cuts back near peers’, or a 2027 guide above +1%.</w:t>
+        <w:t xml:space="preserve">On November 4 NCLH reports 3Q26. Earnings should beat ($0.90 guided against $0.83 consensus), but those cruises were sold before the cuts, so the number that matters is September 30 advance ticket sales, which we expect at $2.94B (−7% y/y). In late February NCLH gives its first 2027 guide, which we expect at or below flat net yield against +1.6% in the consensus case. In May, 1Q27 results test our occupancy of 101.8% and ticket price decline of 2.8%. We would cover if the data turns against us, whatever the price: advance ticket sales of $3.11B or more, a fare-panel re-run showing NCL’s 1H27 Caribbean cuts back near its peers’, or a 2027 guide above +1%.</w:t>
       </w:r>
     </w:p>
     <w:p>
@@ -1711,7 +1727,7 @@
         <w:t xml:space="preserve">Risks and sizing: </w:t>
       </w:r>
       <w:r>
-        <w:t xml:space="preserve">The main risk is a squeeze. 95M shares are short (5.7 days to cover), and the stock rose 48% in six weeks this spring when oil fell. About half of NCLH’s moves follow oil and its peers, so we would start with a third of the position, add on oil- or ceasefire-driven rallies and around November 4 and February, hold part of it in puts, and stop out above $19, where shorts added at about $18 are under water and the bull case begins. Elliott could push for a sale, though net debt above 5x EBITDA makes a buyout hard to finance. We could also be early on timing.</w:t>
+        <w:t xml:space="preserve">The main risk is a squeeze. 95M shares are short (5.7 days to cover), and the stock rose 48% in six weeks this spring when oil fell. Because about half of NCLH’s moves follow oil and its peers, we would start with a third of the position, add on oil- or ceasefire-driven rallies and around November 4 and February, and hold part of the position in puts. We would stop out above $19, where shorts added at about $18 are under water and the bull case begins. Two other risks matter. Elliott could push for a sale, although net debt above 5x EBITDA makes a buyout hard to finance. And we could be early, since the timing of the deposit lag is estimated from eight quarters.</w:t>
       </w:r>
     </w:p>
     <w:p>

</xml_diff>